<commit_message>
getting drafts into template
</commit_message>
<xml_diff>
--- a/drafts/pnas:ecolets/PNAS/Miller-terKuile_pjaySI_Jan2026.docx
+++ b/drafts/pnas:ecolets/PNAS/Miller-terKuile_pjaySI_Jan2026.docx
@@ -275,34 +275,79 @@
         <w:t xml:space="preserve">iagnostics. </w:t>
       </w:r>
       <w:r>
-        <w:t xml:space="preserve">We implemented the above model in the Bayesian software JAGS </w:t>
+        <w:t>We implemented the above model in the Bayesian software JAGS</w:t>
+      </w:r>
+      <w:r>
+        <w:t xml:space="preserve"> </w:t>
       </w:r>
       <w:r>
         <w:fldChar w:fldCharType="begin"/>
       </w:r>
       <w:r>
+        <w:instrText xml:space="preserve"> ADDIN ZOTERO_ITEM CSL_CITATION {"citationID":"c6MiqXYs","properties":{"formattedCitation":"(1)","plainCitation":"(1)","noteIndex":0},"citationItems":[{"id":2379,"uris":["http://zotero.org/users/6391447/items/9RSFP5EG"],"itemData":{"id":2379,"type":"article-journal","container-title":"Proceedings of the 3rd international workshop on distributed statistical computing","issue":"125.10","title":"JAGS: A program for analysis of Bayesian graphical models using Gibbs sampling","volume":"124","author":[{"family":"Plummer","given":"Martyn"}],"issued":{"date-parts":[["2003"]]}}}],"schema":"https://github.com/citation-style-language/schema/raw/master/csl-citation.json"} </w:instrText>
+      </w:r>
+      <w:r>
+        <w:fldChar w:fldCharType="separate"/>
+      </w:r>
+      <w:r>
+        <w:rPr>
+          <w:noProof/>
+        </w:rPr>
+        <w:t>(1)</w:t>
+      </w:r>
+      <w:r>
+        <w:fldChar w:fldCharType="end"/>
+      </w:r>
+      <w:r>
+        <w:t xml:space="preserve"> </w:t>
+      </w:r>
+      <w:r>
+        <w:fldChar w:fldCharType="begin"/>
+      </w:r>
+      <w:r>
         <w:instrText xml:space="preserve"> ADDIN ZOTERO_ITEM CSL_CITATION {"citationID":"TZ9juuFg","properties":{"formattedCitation":"(Plummer, 2003)","plainCitation":"(Plummer, 2003)","dontUpdate":true,"noteIndex":0},"citationItems":[{"id":2379,"uris":["http://zotero.org/users/6391447/items/9RSFP5EG"],"itemData":{"id":2379,"type":"article-journal","container-title":"Proceedings of the 3rd international workshop on distributed statistical computing","issue":"125.10","title":"JAGS: A program for analysis of Bayesian graphical models using Gibbs sampling","volume":"124","author":[{"family":"Plummer","given":"Martyn"}],"issued":{"date-parts":[["2003"]]}}}],"schema":"https://github.com/citation-style-language/schema/raw/master/csl-citation.json"} </w:instrText>
       </w:r>
       <w:r>
         <w:fldChar w:fldCharType="separate"/>
       </w:r>
       <w:r>
+        <w:fldChar w:fldCharType="end"/>
+      </w:r>
+      <w:r>
+        <w:t xml:space="preserve">(version 4.3.0) </w:t>
+      </w:r>
+      <w:r>
+        <w:t xml:space="preserve">using R </w:t>
+      </w:r>
+      <w:r>
+        <w:fldChar w:fldCharType="begin"/>
+      </w:r>
+      <w:r>
+        <w:instrText xml:space="preserve"> ADDIN ZOTERO_ITEM CSL_CITATION {"citationID":"JDoOQTHo","properties":{"formattedCitation":"(2)","plainCitation":"(2)","noteIndex":0},"citationItems":[{"id":104,"uris":["http://zotero.org/users/6391447/items/V7TK7J44"],"itemData":{"id":104,"type":"software","publisher":"R Foundation for Statistical Computing","publisher-place":"Vienna, Austria","title":"R: A language and environment for statistical computing","URL":"https://www.R-project.org/","author":[{"family":"R Core Team","given":""}],"issued":{"date-parts":[["2020"]]}}}],"schema":"https://github.com/citation-style-language/schema/raw/master/csl-citation.json"} </w:instrText>
+      </w:r>
+      <w:r>
+        <w:fldChar w:fldCharType="separate"/>
+      </w:r>
+      <w:r>
         <w:rPr>
           <w:noProof/>
         </w:rPr>
-        <w:t>(Plummer, 2003, version 4.3.0)</w:t>
+        <w:t>(2)</w:t>
       </w:r>
       <w:r>
         <w:fldChar w:fldCharType="end"/>
       </w:r>
       <w:r>
-        <w:t xml:space="preserve"> using R </w:t>
+        <w:t xml:space="preserve"> (version 4.5.1)</w:t>
+      </w:r>
+      <w:r>
+        <w:t xml:space="preserve"> and the jagsUI wrapper package </w:t>
       </w:r>
       <w:r>
         <w:fldChar w:fldCharType="begin"/>
       </w:r>
       <w:r>
-        <w:instrText xml:space="preserve"> ADDIN ZOTERO_ITEM CSL_CITATION {"citationID":"U3P1MDVz","properties":{"formattedCitation":"(R Core Team, 2020)","plainCitation":"(R Core Team, 2020)","dontUpdate":true,"noteIndex":0},"citationItems":[{"id":104,"uris":["http://zotero.org/users/6391447/items/V7TK7J44"],"itemData":{"id":104,"type":"software","publisher":"R Foundation for Statistical Computing","publisher-place":"Vienna, Austria","title":"R: A language and environment for statistical computing","URL":"https://www.R-project.org/","author":[{"family":"R Core Team","given":""}],"issued":{"date-parts":[["2020"]]}}}],"schema":"https://github.com/citation-style-language/schema/raw/master/csl-citation.json"} </w:instrText>
+        <w:instrText xml:space="preserve"> ADDIN ZOTERO_ITEM CSL_CITATION {"citationID":"y9UgwvZO","properties":{"formattedCitation":"(3)","plainCitation":"(3)","noteIndex":0},"citationItems":[{"id":2380,"uris":["http://zotero.org/users/6391447/items/3FKABM4L"],"itemData":{"id":2380,"type":"software","genre":"R","title":"jagsUI: a wrapper around 'rjags' to streamline JAGS analyses","URL":"https://CRAN.R-project.org/package=jagsUI","version":"1.5.2","author":[{"family":"Kellner","given":"K"}],"issued":{"date-parts":[["2021"]]}}}],"schema":"https://github.com/citation-style-language/schema/raw/master/csl-citation.json"} </w:instrText>
       </w:r>
       <w:r>
         <w:fldChar w:fldCharType="separate"/>
@@ -311,27 +356,22 @@
         <w:rPr>
           <w:noProof/>
         </w:rPr>
-        <w:t>(R Core Team, 2020, version 4.5.1)</w:t>
+        <w:t>(3)</w:t>
       </w:r>
       <w:r>
         <w:fldChar w:fldCharType="end"/>
       </w:r>
       <w:r>
-        <w:t xml:space="preserve"> and the </w:t>
-      </w:r>
-      <w:proofErr w:type="spellStart"/>
-      <w:r>
-        <w:t>jagsUI</w:t>
-      </w:r>
-      <w:proofErr w:type="spellEnd"/>
-      <w:r>
-        <w:t xml:space="preserve"> wrapper package </w:t>
+        <w:t xml:space="preserve"> (version 1.6.2)</w:t>
+      </w:r>
+      <w:r>
+        <w:t xml:space="preserve">. JAGS uses Markov chain Monte Carlo (MCMC) methods to sample from the joint posterior distribution of the model parameters. We initially produced 4000 samples for three parallel MCMC sequences to determine the number of iterations (samples) needed to sufficiently sample from the posterior based on the Raftery diagnostic </w:t>
       </w:r>
       <w:r>
         <w:fldChar w:fldCharType="begin"/>
       </w:r>
       <w:r>
-        <w:instrText xml:space="preserve"> ADDIN ZOTERO_ITEM CSL_CITATION {"citationID":"J4TKAO6M","properties":{"formattedCitation":"(Kellner, 2021)","plainCitation":"(Kellner, 2021)","dontUpdate":true,"noteIndex":0},"citationItems":[{"id":2380,"uris":["http://zotero.org/users/6391447/items/3FKABM4L"],"itemData":{"id":2380,"type":"software","genre":"R","title":"jagsUI: a wrapper around 'rjags' to streamline JAGS analyses","URL":"https://CRAN.R-project.org/package=jagsUI","version":"1.5.2","author":[{"family":"Kellner","given":"K"}],"issued":{"date-parts":[["2021"]]}}}],"schema":"https://github.com/citation-style-language/schema/raw/master/csl-citation.json"} </w:instrText>
+        <w:instrText xml:space="preserve"> ADDIN ZOTERO_ITEM CSL_CITATION {"citationID":"plsHxVHs","properties":{"formattedCitation":"(4)","plainCitation":"(4)","noteIndex":0},"citationItems":[{"id":2378,"uris":["http://zotero.org/users/6391447/items/JLZKIT24"],"itemData":{"id":2378,"type":"chapter","container-title":"Practical Markov Chain Monte Carlo","publisher":"Chapman and Hall","publisher-place":"London, U.K.","title":"The number of iterations, convergence diagnostics and generic Netropolis algorithms","author":[{"family":"Raftery","given":"A.E."},{"family":"Lewis","given":"S.M."}],"issued":{"date-parts":[["1995"]]}}}],"schema":"https://github.com/citation-style-language/schema/raw/master/csl-citation.json"} </w:instrText>
       </w:r>
       <w:r>
         <w:fldChar w:fldCharType="separate"/>
@@ -340,19 +380,19 @@
         <w:rPr>
           <w:noProof/>
         </w:rPr>
-        <w:t>(Kellner, 2021, version 1.6.2)</w:t>
+        <w:t>(4)</w:t>
       </w:r>
       <w:r>
         <w:fldChar w:fldCharType="end"/>
       </w:r>
       <w:r>
-        <w:t xml:space="preserve">. JAGS uses Markov chain Monte Carlo (MCMC) methods to sample from the joint posterior distribution of the model parameters. We initially produced 4000 samples for three parallel MCMC sequences to determine the number of iterations (samples) needed to sufficiently sample from the posterior based on the Raftery diagnostic </w:t>
+        <w:t xml:space="preserve">, and we re-ran the model to obtain a sufficient number of iterations. We qualitatively assessed convergence of the MCMC sequences by inspecting history and autocorrelation plots generated with the mcmcplots package </w:t>
       </w:r>
       <w:r>
         <w:fldChar w:fldCharType="begin"/>
       </w:r>
       <w:r>
-        <w:instrText xml:space="preserve"> ADDIN ZOTERO_ITEM CSL_CITATION {"citationID":"plsHxVHs","properties":{"formattedCitation":"(Raftery &amp; Lewis, 1995)","plainCitation":"(Raftery &amp; Lewis, 1995)","noteIndex":0},"citationItems":[{"id":2378,"uris":["http://zotero.org/users/6391447/items/JLZKIT24"],"itemData":{"id":2378,"type":"chapter","container-title":"Practical Markov Chain Monte Carlo","publisher":"Chapman and Hall","publisher-place":"London, U.K.","title":"The number of iterations, convergence diagnostics and generic Netropolis algorithms","author":[{"family":"Raftery","given":"A.E."},{"family":"Lewis","given":"S.M."}],"issued":{"date-parts":[["1995"]]}}}],"schema":"https://github.com/citation-style-language/schema/raw/master/csl-citation.json"} </w:instrText>
+        <w:instrText xml:space="preserve"> ADDIN ZOTERO_ITEM CSL_CITATION {"citationID":"nbdai1o4","properties":{"formattedCitation":"(5)","plainCitation":"(5)","noteIndex":0},"citationItems":[{"id":2742,"uris":["http://zotero.org/users/6391447/items/J9AIIYIQ"],"itemData":{"id":2742,"type":"dataset","abstract":"Functions for convenient plotting and viewing of MCMC output.","DOI":"10.32614/CRAN.package.mcmcplots","language":"en","note":"Institution: Comprehensive R Archive Network\npage: 0.4.3","source":"DOI.org (Crossref)","title":"mcmcplots: Create Plots from MCMC Output","title-short":"mcmcplots","URL":"https://CRAN.R-project.org/package=mcmcplots","author":[{"family":"Curtis","given":"S. McKay"}],"accessed":{"date-parts":[["2025",2,24]]},"issued":{"date-parts":[["2010",7,6]]}}}],"schema":"https://github.com/citation-style-language/schema/raw/master/csl-citation.json"} </w:instrText>
       </w:r>
       <w:r>
         <w:fldChar w:fldCharType="separate"/>
@@ -361,27 +401,22 @@
         <w:rPr>
           <w:noProof/>
         </w:rPr>
-        <w:t>(Raftery &amp; Lewis, 1995)</w:t>
+        <w:t>(5)</w:t>
       </w:r>
       <w:r>
         <w:fldChar w:fldCharType="end"/>
       </w:r>
       <w:r>
-        <w:t xml:space="preserve">, and we re-ran the model to obtain a sufficient number of iterations. We qualitatively assessed convergence of the MCMC sequences by inspecting history and autocorrelation plots generated with the </w:t>
-      </w:r>
-      <w:proofErr w:type="spellStart"/>
-      <w:r>
-        <w:t>mcmcplots</w:t>
-      </w:r>
-      <w:proofErr w:type="spellEnd"/>
-      <w:r>
-        <w:t xml:space="preserve"> package </w:t>
+        <w:t xml:space="preserve"> (version 0.4.3)</w:t>
+      </w:r>
+      <w:r>
+        <w:t xml:space="preserve">. We quantitatively evaluated convergence using the raftery.diag function in the coda package </w:t>
       </w:r>
       <w:r>
         <w:fldChar w:fldCharType="begin"/>
       </w:r>
       <w:r>
-        <w:instrText xml:space="preserve"> ADDIN ZOTERO_ITEM CSL_CITATION {"citationID":"eoEaHWxj","properties":{"formattedCitation":"(Curtis, 2010)","plainCitation":"(Curtis, 2010)","dontUpdate":true,"noteIndex":0},"citationItems":[{"id":2742,"uris":["http://zotero.org/users/6391447/items/J9AIIYIQ"],"itemData":{"id":2742,"type":"dataset","abstract":"Functions for convenient plotting and viewing of MCMC output.","DOI":"10.32614/CRAN.package.mcmcplots","language":"en","note":"Institution: Comprehensive R Archive Network\npage: 0.4.3","source":"DOI.org (Crossref)","title":"mcmcplots: Create Plots from MCMC Output","title-short":"mcmcplots","URL":"https://CRAN.R-project.org/package=mcmcplots","author":[{"family":"Curtis","given":"S. McKay"}],"accessed":{"date-parts":[["2025",2,24]]},"issued":{"date-parts":[["2010",7,6]]}}}],"schema":"https://github.com/citation-style-language/schema/raw/master/csl-citation.json"} </w:instrText>
+        <w:instrText xml:space="preserve"> ADDIN ZOTERO_ITEM CSL_CITATION {"citationID":"3JABjN7A","properties":{"formattedCitation":"(6)","plainCitation":"(6)","noteIndex":0},"citationItems":[{"id":2741,"uris":["http://zotero.org/users/6391447/items/G5FC7FXU"],"itemData":{"id":2741,"type":"dataset","abstract":"Provides functions for summarizing and plotting the output from Markov Chain Monte Carlo (MCMC) simulations, as well as diagnostic tests of convergence to the equilibrium distribution of the Markov chain.","DOI":"10.32614/CRAN.package.coda","language":"en","note":"Institution: Comprehensive R Archive Network\npage: 0.19-4.1","source":"DOI.org (Crossref)","title":"coda: Output Analysis and Diagnostics for MCMC","title-short":"coda","URL":"https://CRAN.R-project.org/package=coda","author":[{"family":"Plummer","given":"Martyn"},{"family":"Best","given":"Nicky"},{"family":"Cowles","given":"Kate"},{"family":"Vines","given":"Karen"},{"family":"Sarkar","given":"Deepayan"},{"family":"Bates","given":"Douglas"},{"family":"Almond","given":"Russell"},{"family":"Magnusson","given":"Arni"}],"accessed":{"date-parts":[["2025",2,24]]},"issued":{"date-parts":[["1999",6,4]]}}}],"schema":"https://github.com/citation-style-language/schema/raw/master/csl-citation.json"} </w:instrText>
       </w:r>
       <w:r>
         <w:fldChar w:fldCharType="separate"/>
@@ -390,39 +425,13 @@
         <w:rPr>
           <w:noProof/>
         </w:rPr>
-        <w:t>(Curtis, 2010, version 0.4.3)</w:t>
+        <w:t>(6)</w:t>
       </w:r>
       <w:r>
         <w:fldChar w:fldCharType="end"/>
       </w:r>
       <w:r>
-        <w:t xml:space="preserve">. We quantitatively evaluated convergence using the </w:t>
-      </w:r>
-      <w:proofErr w:type="spellStart"/>
-      <w:r>
-        <w:t>raftery.diag</w:t>
-      </w:r>
-      <w:proofErr w:type="spellEnd"/>
-      <w:r>
-        <w:t xml:space="preserve"> function in the coda package </w:t>
-      </w:r>
-      <w:r>
-        <w:fldChar w:fldCharType="begin"/>
-      </w:r>
-      <w:r>
-        <w:instrText xml:space="preserve"> ADDIN ZOTERO_ITEM CSL_CITATION {"citationID":"BH742N9I","properties":{"formattedCitation":"(Plummer et al., 1999)","plainCitation":"(Plummer et al., 1999)","dontUpdate":true,"noteIndex":0},"citationItems":[{"id":2741,"uris":["http://zotero.org/users/6391447/items/G5FC7FXU"],"itemData":{"id":2741,"type":"dataset","abstract":"Provides functions for summarizing and plotting the output from Markov Chain Monte Carlo (MCMC) simulations, as well as diagnostic tests of convergence to the equilibrium distribution of the Markov chain.","DOI":"10.32614/CRAN.package.coda","language":"en","note":"Institution: Comprehensive R Archive Network\npage: 0.19-4.1","source":"DOI.org (Crossref)","title":"coda: Output Analysis and Diagnostics for MCMC","title-short":"coda","URL":"https://CRAN.R-project.org/package=coda","author":[{"family":"Plummer","given":"Martyn"},{"family":"Best","given":"Nicky"},{"family":"Cowles","given":"Kate"},{"family":"Vines","given":"Karen"},{"family":"Sarkar","given":"Deepayan"},{"family":"Bates","given":"Douglas"},{"family":"Almond","given":"Russell"},{"family":"Magnusson","given":"Arni"}],"accessed":{"date-parts":[["2025",2,24]]},"issued":{"date-parts":[["1999",6,4]]}}}],"schema":"https://github.com/citation-style-language/schema/raw/master/csl-citation.json"} </w:instrText>
-      </w:r>
-      <w:r>
-        <w:fldChar w:fldCharType="separate"/>
-      </w:r>
-      <w:r>
-        <w:rPr>
-          <w:noProof/>
-        </w:rPr>
-        <w:t>(Plummer et al., 1999, version 0.19.4.1)</w:t>
-      </w:r>
-      <w:r>
-        <w:fldChar w:fldCharType="end"/>
+        <w:t xml:space="preserve"> (version 0.19.4.1)</w:t>
       </w:r>
       <w:r>
         <w:t xml:space="preserve">; the MCMC sequences were deemed to have converged if the Gelman-Rubin statistic, </w:t>
@@ -453,7 +462,7 @@
         <w:fldChar w:fldCharType="begin"/>
       </w:r>
       <w:r>
-        <w:instrText xml:space="preserve"> ADDIN ZOTERO_ITEM CSL_CITATION {"citationID":"heDqza6f","properties":{"formattedCitation":"(Gelman &amp; Rubin, 1992)","plainCitation":"(Gelman &amp; Rubin, 1992)","noteIndex":0},"citationItems":[{"id":2743,"uris":["http://zotero.org/users/6391447/items/EFEP3P3V"],"itemData":{"id":2743,"type":"article-journal","container-title":"Statistical Science","DOI":"10.1214/ss/1177011136","ISSN":"0883-4237","issue":"4","journalAbbreviation":"Statist. Sci.","source":"DOI.org (Crossref)","title":"Inference from Iterative Simulation Using Multiple Sequences","URL":"https://projecteuclid.org/journals/statistical-science/volume-7/issue-4/Inference-from-Iterative-Simulation-Using-Multiple-Sequences/10.1214/ss/1177011136.full","volume":"7","author":[{"family":"Gelman","given":"Andrew"},{"family":"Rubin","given":"Donald B."}],"accessed":{"date-parts":[["2025",2,24]]},"issued":{"date-parts":[["1992",11,1]]}}}],"schema":"https://github.com/citation-style-language/schema/raw/master/csl-citation.json"} </w:instrText>
+        <w:instrText xml:space="preserve"> ADDIN ZOTERO_ITEM CSL_CITATION {"citationID":"heDqza6f","properties":{"formattedCitation":"(7)","plainCitation":"(7)","noteIndex":0},"citationItems":[{"id":2743,"uris":["http://zotero.org/users/6391447/items/EFEP3P3V"],"itemData":{"id":2743,"type":"article-journal","container-title":"Statistical Science","DOI":"10.1214/ss/1177011136","ISSN":"0883-4237","issue":"4","journalAbbreviation":"Statist. Sci.","source":"DOI.org (Crossref)","title":"Inference from Iterative Simulation Using Multiple Sequences","URL":"https://projecteuclid.org/journals/statistical-science/volume-7/issue-4/Inference-from-Iterative-Simulation-Using-Multiple-Sequences/10.1214/ss/1177011136.full","volume":"7","author":[{"family":"Gelman","given":"Andrew"},{"family":"Rubin","given":"Donald B."}],"accessed":{"date-parts":[["2025",2,24]]},"issued":{"date-parts":[["1992",11,1]]}}}],"schema":"https://github.com/citation-style-language/schema/raw/master/csl-citation.json"} </w:instrText>
       </w:r>
       <w:r>
         <w:fldChar w:fldCharType="separate"/>
@@ -462,7 +471,7 @@
         <w:rPr>
           <w:noProof/>
         </w:rPr>
-        <w:t>(Gelman &amp; Rubin, 1992)</w:t>
+        <w:t>(7)</w:t>
       </w:r>
       <w:r>
         <w:fldChar w:fldCharType="end"/>
@@ -480,21 +489,13 @@
         <w:t xml:space="preserve">quation </w:t>
       </w:r>
       <w:r>
-        <w:t xml:space="preserve">(1). We tested for spatial dependence in the residuals (observed – predicted counts) within each year using spline correlograms produced by the R package </w:t>
-      </w:r>
-      <w:proofErr w:type="spellStart"/>
-      <w:r>
-        <w:t>ncf</w:t>
-      </w:r>
-      <w:proofErr w:type="spellEnd"/>
-      <w:r>
-        <w:t xml:space="preserve"> </w:t>
+        <w:t xml:space="preserve">(1). We tested for spatial dependence in the residuals (observed – predicted counts) within each year using spline correlograms produced by the R package ncf </w:t>
       </w:r>
       <w:r>
         <w:fldChar w:fldCharType="begin"/>
       </w:r>
       <w:r>
-        <w:instrText xml:space="preserve"> ADDIN ZOTERO_ITEM CSL_CITATION {"citationID":"suDKjiax","properties":{"formattedCitation":"(Bjornstad, 2008)","plainCitation":"(Bjornstad, 2008)","dontUpdate":true,"noteIndex":0},"citationItems":[{"id":2901,"uris":["http://zotero.org/users/6391447/items/GJAI95VD"],"itemData":{"id":2901,"type":"dataset","DOI":"10.32614/cran.package.ncf","note":"collection-title: CRAN: Contributed Packages","publisher":"The R Foundation","source":"Crossref","title":"ncf: Spatial Covariance Functions","title-short":"ncf","URL":"https://CRAN.R-project.org/package=ncf","author":[{"family":"Bjornstad","given":"Ottar N."}],"accessed":{"date-parts":[["2025",7,16]]},"issued":{"date-parts":[["2008",4,14]]}}}],"schema":"https://github.com/citation-style-language/schema/raw/master/csl-citation.json"} </w:instrText>
+        <w:instrText xml:space="preserve"> ADDIN ZOTERO_ITEM CSL_CITATION {"citationID":"d0JcRoqX","properties":{"formattedCitation":"(8)","plainCitation":"(8)","noteIndex":0},"citationItems":[{"id":2901,"uris":["http://zotero.org/users/6391447/items/GJAI95VD"],"itemData":{"id":2901,"type":"dataset","DOI":"10.32614/cran.package.ncf","note":"collection-title: CRAN: Contributed Packages","publisher":"The R Foundation","source":"Crossref","title":"ncf: Spatial Covariance Functions","title-short":"ncf","URL":"https://CRAN.R-project.org/package=ncf","author":[{"family":"Bjornstad","given":"Ottar N."}],"accessed":{"date-parts":[["2025",7,16]]},"issued":{"date-parts":[["2008",4,14]]}}}],"schema":"https://github.com/citation-style-language/schema/raw/master/csl-citation.json"} </w:instrText>
       </w:r>
       <w:r>
         <w:fldChar w:fldCharType="separate"/>
@@ -503,13 +504,13 @@
         <w:rPr>
           <w:noProof/>
         </w:rPr>
-        <w:t>(Bjornstad, 2008, version 1.3-2)</w:t>
+        <w:t>(8)</w:t>
       </w:r>
       <w:r>
         <w:fldChar w:fldCharType="end"/>
       </w:r>
       <w:r>
-        <w:t xml:space="preserve">. </w:t>
+        <w:t xml:space="preserve"> (version 1.3-2).</w:t>
       </w:r>
     </w:p>
     <w:p>
@@ -567,11 +568,11 @@
         <w:t xml:space="preserve">alidation. </w:t>
       </w:r>
       <w:r>
-        <w:t xml:space="preserve">To evaluate predictions outside of the data used to fit the model, we first removed the in-sample (“training”) data (22,295 checklists) from the available eBird checklist data (833,834 checklists). We performed the same set of steps for spatial and temporal stratification (Section 4.3.1 above) on the remaining checklists (811,539 checklists) for an additional 20,380 checklists that represented “out-of-sample” (“validation”) data. We </w:t>
+        <w:t xml:space="preserve">To evaluate predictions outside of the data used to fit the model, we first removed the in-sample (“training”) data (22,295 checklists) from the available eBird checklist data (833,834 checklists). We performed the same set of steps for spatial and temporal stratification on the remaining checklists (811,539 checklists) for an additional 20,380 checklists that represented “out-of-sample” (“validation”) data. We evaluated out-of-sample model fit using ~1000 posterior samples for covariate effects and intercepts from the in-sample </w:t>
       </w:r>
       <w:r>
         <w:lastRenderedPageBreak/>
-        <w:t>evaluated out-of-sample model fit using ~1000 posterior samples for covariate effects and intercepts from the in-sample dataset and model. We then examined model replicative ability (RMSE) of the in-sample and out-of-sample datasets. Model convergence, performance, and goodness-of-fit statistics can be found in the Supporting Information.</w:t>
+        <w:t xml:space="preserve">dataset and model. We then examined model replicative ability (RMSE) of the in-sample and out-of-sample datasets. </w:t>
       </w:r>
     </w:p>
     <w:p>
@@ -584,16 +585,50 @@
           <w:b/>
           <w:bCs/>
         </w:rPr>
+        <w:t xml:space="preserve">Permuted Variable Importance. </w:t>
+      </w:r>
+      <w:r>
+        <w:t xml:space="preserve">We determined variable importance for our 5 covariates by permuting each covariate 100 times and assessing mean decrease in accuracy relative to intact data based on changes in RMSE </w:t>
+      </w:r>
+      <w:r>
+        <w:fldChar w:fldCharType="begin"/>
+      </w:r>
+      <w:r>
+        <w:instrText xml:space="preserve"> ADDIN ZOTERO_ITEM CSL_CITATION {"citationID":"XFMTPJqz","properties":{"formattedCitation":"(9)","plainCitation":"(9)","noteIndex":0},"citationItems":[{"id":3181,"uris":["http://zotero.org/groups/5634119/items/LWRP8VR9"],"itemData":{"id":3181,"type":"article-journal","container-title":"Machine Learning","DOI":"10.1023/A:1010933404324","ISSN":"0885-6125, 1573-0565","issue":"1","journalAbbreviation":"Machine Learning","language":"en","page":"5-32","source":"DOI.org (Crossref)","title":"Random Forests","volume":"45","author":[{"family":"Breiman","given":"Leo"}],"issued":{"date-parts":[["2001",10]]}}}],"schema":"https://github.com/citation-style-language/schema/raw/master/csl-citation.json"} </w:instrText>
+      </w:r>
+      <w:r>
+        <w:fldChar w:fldCharType="separate"/>
+      </w:r>
+      <w:r>
+        <w:rPr>
+          <w:noProof/>
+        </w:rPr>
+        <w:t>(9)</w:t>
+      </w:r>
+      <w:r>
+        <w:fldChar w:fldCharType="end"/>
+      </w:r>
+    </w:p>
+    <w:p>
+      <w:pPr>
+        <w:pStyle w:val="BodyText"/>
+        <w:spacing w:after="0"/>
+      </w:pPr>
+      <w:r>
+        <w:rPr>
+          <w:b/>
+          <w:bCs/>
+        </w:rPr>
         <w:t xml:space="preserve">Software Used. </w:t>
       </w:r>
       <w:r>
-        <w:t xml:space="preserve">We implemented the N-mixture model with the stochastic antecedent modeling framework described in the main text in the Bayesian software JAGS </w:t>
+        <w:t xml:space="preserve">We prepared data using the here </w:t>
       </w:r>
       <w:r>
         <w:fldChar w:fldCharType="begin"/>
       </w:r>
       <w:r>
-        <w:instrText xml:space="preserve"> ADDIN ZOTERO_ITEM CSL_CITATION {"citationID":"TZ9juuFg","properties":{"formattedCitation":"(Plummer, 2003)","plainCitation":"(Plummer, 2003)","dontUpdate":true,"noteIndex":0},"citationItems":[{"id":2379,"uris":["http://zotero.org/users/6391447/items/9RSFP5EG"],"itemData":{"id":2379,"type":"article-journal","container-title":"Proceedings of the 3rd international workshop on distributed statistical computing","issue":"125.10","title":"JAGS: A program for analysis of Bayesian graphical models using Gibbs sampling","volume":"124","author":[{"family":"Plummer","given":"Martyn"}],"issued":{"date-parts":[["2003"]]}}}],"schema":"https://github.com/citation-style-language/schema/raw/master/csl-citation.json"} </w:instrText>
+        <w:instrText xml:space="preserve"> ADDIN ZOTERO_ITEM CSL_CITATION {"citationID":"iVCoRDja","properties":{"formattedCitation":"(10)","plainCitation":"(10)","noteIndex":0},"citationItems":[{"id":101,"uris":["http://zotero.org/users/6391447/items/QLQDJ9T4"],"itemData":{"id":101,"type":"software","genre":"R","title":"here: A simpler way to find your files","URL":"https://CRAN.R-project.org/package=here","version":"1.0.1","author":[{"family":"Muller","given":"Kirill"}],"issued":{"date-parts":[["2020"]]}}}],"schema":"https://github.com/citation-style-language/schema/raw/master/csl-citation.json"} </w:instrText>
       </w:r>
       <w:r>
         <w:fldChar w:fldCharType="separate"/>
@@ -602,19 +637,22 @@
         <w:rPr>
           <w:noProof/>
         </w:rPr>
-        <w:t>(Plummer, 2003, version 4.3.0)</w:t>
+        <w:t>(10)</w:t>
       </w:r>
       <w:r>
         <w:fldChar w:fldCharType="end"/>
       </w:r>
       <w:r>
-        <w:t xml:space="preserve"> using R </w:t>
+        <w:t xml:space="preserve"> (version 1.0.1),</w:t>
+      </w:r>
+      <w:r>
+        <w:t xml:space="preserve"> tidyverse </w:t>
       </w:r>
       <w:r>
         <w:fldChar w:fldCharType="begin"/>
       </w:r>
       <w:r>
-        <w:instrText xml:space="preserve"> ADDIN ZOTERO_ITEM CSL_CITATION {"citationID":"U3P1MDVz","properties":{"formattedCitation":"(R Core Team, 2020)","plainCitation":"(R Core Team, 2020)","dontUpdate":true,"noteIndex":0},"citationItems":[{"id":104,"uris":["http://zotero.org/users/6391447/items/V7TK7J44"],"itemData":{"id":104,"type":"software","event-place":"Vienna, Austria","publisher":"R Foundation for Statistical Computing","publisher-place":"Vienna, Austria","title":"R: A language and environment for statistical computing","URL":"https://www.R-project.org/","author":[{"family":"R Core Team","given":""}],"issued":{"date-parts":[["2020"]]}}}],"schema":"https://github.com/citation-style-language/schema/raw/master/csl-citation.json"} </w:instrText>
+        <w:instrText xml:space="preserve"> ADDIN ZOTERO_ITEM CSL_CITATION {"citationID":"JJVtgo5A","properties":{"formattedCitation":"(11)","plainCitation":"(11)","noteIndex":0},"citationItems":[{"id":103,"uris":["http://zotero.org/users/6391447/items/Z5MZP2MP"],"itemData":{"id":103,"type":"article-journal","abstract":"At a high level, the tidyverse is a language for solving data science challenges with R code. Its primary goal is to facilitate a conversation between a human and a computer about data. Less abstractly, the tidyverse is a collection of R packages that share a high-level design philosophy and low-level grammar and data structures, so that learning one package makes it easier to learn the next.","container-title":"Journal of Open Source Software","DOI":"10.21105/joss.01686","ISSN":"2475-9066","issue":"43","journalAbbreviation":"JOSS","language":"en","page":"1686","source":"DOI.org (Crossref)","title":"Welcome to the Tidyverse","volume":"4","author":[{"family":"Wickham","given":"Hadley"},{"family":"Averick","given":"Mara"},{"family":"Bryan","given":"Jennifer"},{"family":"Chang","given":"Winston"},{"family":"McGowan","given":"Lucy"},{"family":"François","given":"Romain"},{"family":"Grolemund","given":"Garrett"},{"family":"Hayes","given":"Alex"},{"family":"Henry","given":"Lionel"},{"family":"Hester","given":"Jim"},{"family":"Kuhn","given":"Max"},{"family":"Pedersen","given":"Thomas"},{"family":"Miller","given":"Evan"},{"family":"Bache","given":"Stephan"},{"family":"Müller","given":"Kirill"},{"family":"Ooms","given":"Jeroen"},{"family":"Robinson","given":"David"},{"family":"Seidel","given":"Dana"},{"family":"Spinu","given":"Vitalie"},{"family":"Takahashi","given":"Kohske"},{"family":"Vaughan","given":"Davis"},{"family":"Wilke","given":"Claus"},{"family":"Woo","given":"Kara"},{"family":"Yutani","given":"Hiroaki"}],"issued":{"date-parts":[["2019",11,21]]}}}],"schema":"https://github.com/citation-style-language/schema/raw/master/csl-citation.json"} </w:instrText>
       </w:r>
       <w:r>
         <w:fldChar w:fldCharType="separate"/>
@@ -623,27 +661,22 @@
         <w:rPr>
           <w:noProof/>
         </w:rPr>
-        <w:t>(R Core Team, 2020, version 4.5.1)</w:t>
+        <w:t>(11)</w:t>
       </w:r>
       <w:r>
         <w:fldChar w:fldCharType="end"/>
       </w:r>
       <w:r>
-        <w:t xml:space="preserve"> and the </w:t>
-      </w:r>
-      <w:proofErr w:type="spellStart"/>
-      <w:r>
-        <w:t>jagsUI</w:t>
-      </w:r>
-      <w:proofErr w:type="spellEnd"/>
-      <w:r>
-        <w:t xml:space="preserve"> wrapper package </w:t>
+        <w:t xml:space="preserve"> (version 2.0.0)</w:t>
+      </w:r>
+      <w:r>
+        <w:t xml:space="preserve">, sf </w:t>
       </w:r>
       <w:r>
         <w:fldChar w:fldCharType="begin"/>
       </w:r>
       <w:r>
-        <w:instrText xml:space="preserve"> ADDIN ZOTERO_ITEM CSL_CITATION {"citationID":"J4TKAO6M","properties":{"formattedCitation":"(Kellner, 2021)","plainCitation":"(Kellner, 2021)","dontUpdate":true,"noteIndex":0},"citationItems":[{"id":2380,"uris":["http://zotero.org/users/6391447/items/3FKABM4L"],"itemData":{"id":2380,"type":"software","genre":"R","title":"jagsUI: a wrapper around 'rjags' to streamline JAGS analyses","URL":"https://CRAN.R-project.org/package=jagsUI","version":"1.5.2","author":[{"family":"Kellner","given":"K"}],"issued":{"date-parts":[["2021"]]}}}],"schema":"https://github.com/citation-style-language/schema/raw/master/csl-citation.json"} </w:instrText>
+        <w:instrText xml:space="preserve"> ADDIN ZOTERO_ITEM CSL_CITATION {"citationID":"vCL98oU3","properties":{"formattedCitation":"(12)","plainCitation":"(12)","noteIndex":0},"citationItems":[{"id":2884,"uris":["http://zotero.org/groups/5634119/items/R9PIG4SB"],"itemData":{"id":2884,"type":"book","DOI":"10.1201/9780429459016","edition":"1","ISBN":"978-0-429-45901-6","language":"en","publisher":"Chapman and Hall/CRC","publisher-place":"New York","source":"Crossref","title":"Spatial Data Science: With Applications in R","title-short":"Spatial Data Science","URL":"https://www.taylorfrancis.com/books/9780429459016","author":[{"family":"Pebesma","given":"Edzer"},{"family":"Bivand","given":"Roger"}],"accessed":{"date-parts":[["2025",7,16]]},"issued":{"date-parts":[["2023",5,10]]}}}],"schema":"https://github.com/citation-style-language/schema/raw/master/csl-citation.json"} </w:instrText>
       </w:r>
       <w:r>
         <w:fldChar w:fldCharType="separate"/>
@@ -652,19 +685,22 @@
         <w:rPr>
           <w:noProof/>
         </w:rPr>
-        <w:t>(Kellner, 2021, version 1.6.2)</w:t>
+        <w:t>(12)</w:t>
       </w:r>
       <w:r>
         <w:fldChar w:fldCharType="end"/>
       </w:r>
       <w:r>
-        <w:t xml:space="preserve">. We prepared data using the here </w:t>
+        <w:t xml:space="preserve"> (version 1.0.21)</w:t>
+      </w:r>
+      <w:r>
+        <w:t xml:space="preserve">, terra </w:t>
       </w:r>
       <w:r>
         <w:fldChar w:fldCharType="begin"/>
       </w:r>
       <w:r>
-        <w:instrText xml:space="preserve"> ADDIN ZOTERO_ITEM CSL_CITATION {"citationID":"Va8Ahm78","properties":{"formattedCitation":"(Muller, 2020)","plainCitation":"(Muller, 2020)","dontUpdate":true,"noteIndex":0},"citationItems":[{"id":101,"uris":["http://zotero.org/users/6391447/items/QLQDJ9T4"],"itemData":{"id":101,"type":"software","genre":"R","title":"here: A simpler way to find your files","URL":"https://CRAN.R-project.org/package=here","version":"1.0.1","author":[{"family":"Muller","given":"Kirill"}],"issued":{"date-parts":[["2020"]]}}}],"schema":"https://github.com/citation-style-language/schema/raw/master/csl-citation.json"} </w:instrText>
+        <w:instrText xml:space="preserve"> ADDIN ZOTERO_ITEM CSL_CITATION {"citationID":"npvBE2RA","properties":{"formattedCitation":"(13)","plainCitation":"(13)","noteIndex":0},"citationItems":[{"id":2885,"uris":["http://zotero.org/groups/5634119/items/7HSV3ZUH"],"itemData":{"id":2885,"type":"dataset","DOI":"10.32614/cran.package.terra","note":"collection-title: CRAN: Contributed Packages","publisher":"The R Foundation","source":"Crossref","title":"terra: Spatial Data Analysis","title-short":"terra","URL":"https://CRAN.R-project.org/package=terra","author":[{"family":"Hijmans","given":"Robert J."}],"accessed":{"date-parts":[["2025",7,16]]},"issued":{"date-parts":[["2020",3,20]]}}}],"schema":"https://github.com/citation-style-language/schema/raw/master/csl-citation.json"} </w:instrText>
       </w:r>
       <w:r>
         <w:fldChar w:fldCharType="separate"/>
@@ -673,321 +709,235 @@
         <w:rPr>
           <w:noProof/>
         </w:rPr>
-        <w:t>(Muller, 2020, version 1.0.1)</w:t>
+        <w:t>(13)</w:t>
       </w:r>
       <w:r>
         <w:fldChar w:fldCharType="end"/>
       </w:r>
       <w:r>
-        <w:t xml:space="preserve">, </w:t>
-      </w:r>
-      <w:proofErr w:type="spellStart"/>
-      <w:r>
-        <w:t>tidyverse</w:t>
-      </w:r>
-      <w:proofErr w:type="spellEnd"/>
+        <w:t xml:space="preserve"> (version 1.8.54)</w:t>
+      </w:r>
+      <w:r>
+        <w:t xml:space="preserve">, readxl </w:t>
+      </w:r>
+      <w:r>
+        <w:fldChar w:fldCharType="begin"/>
+      </w:r>
+      <w:r>
+        <w:instrText xml:space="preserve"> ADDIN ZOTERO_ITEM CSL_CITATION {"citationID":"RDUeb2wh","properties":{"formattedCitation":"(14)","plainCitation":"(14)","noteIndex":0},"citationItems":[{"id":2745,"uris":["http://zotero.org/users/6391447/items/IBQSLUBY"],"itemData":{"id":2745,"type":"dataset","abstract":"Import excel files into R. Supports '.xls' via the embedded 'libxls' C library &lt;https://github.com/libxls/libxls&gt; and '.xlsx' via the embedded 'RapidXML' C++ library &lt;https://rapidxml.sourceforge.net/&gt;. Works on Windows, Mac and Linux without external dependencies.","DOI":"10.32614/CRAN.package.readxl","language":"en","note":"Institution: Comprehensive R Archive Network\npage: 1.4.3","source":"DOI.org (Crossref)","title":"readxl: Read Excel Files","title-short":"readxl","URL":"https://CRAN.R-project.org/package=readxl","author":[{"family":"Wickham","given":"Hadley"},{"family":"Bryan","given":"Jennifer"}],"accessed":{"date-parts":[["2025",2,24]]},"issued":{"date-parts":[["2015",4,14]]}}}],"schema":"https://github.com/citation-style-language/schema/raw/master/csl-citation.json"} </w:instrText>
+      </w:r>
+      <w:r>
+        <w:fldChar w:fldCharType="separate"/>
+      </w:r>
+      <w:r>
+        <w:rPr>
+          <w:noProof/>
+        </w:rPr>
+        <w:t>(14)</w:t>
+      </w:r>
+      <w:r>
+        <w:fldChar w:fldCharType="end"/>
+      </w:r>
+      <w:r>
+        <w:t xml:space="preserve"> (version 1.4.5)</w:t>
+      </w:r>
+      <w:r>
+        <w:t xml:space="preserve">, exactextractr </w:t>
+      </w:r>
+      <w:r>
+        <w:fldChar w:fldCharType="begin"/>
+      </w:r>
+      <w:r>
+        <w:instrText xml:space="preserve"> ADDIN ZOTERO_ITEM CSL_CITATION {"citationID":"9Kk5ikoP","properties":{"formattedCitation":"(15)","plainCitation":"(15)","noteIndex":0},"citationItems":[{"id":2887,"uris":["http://zotero.org/users/6391447/items/E2DRXRIV"],"itemData":{"id":2887,"type":"dataset","DOI":"10.32614/cran.package.exactextractr","note":"collection-title: CRAN: Contributed Packages","publisher":"The R Foundation","source":"Crossref","title":"exactextractr: Fast Extraction from Raster Datasets using Polygons","title-short":"exactextractr","URL":"https://CRAN.R-project.org/package=exactextractr","author":[{"literal":"Daniel Baston"}],"accessed":{"date-parts":[["2025",7,16]]},"issued":{"date-parts":[["2019",8,1]]}}}],"schema":"https://github.com/citation-style-language/schema/raw/master/csl-citation.json"} </w:instrText>
+      </w:r>
+      <w:r>
+        <w:fldChar w:fldCharType="separate"/>
+      </w:r>
+      <w:r>
+        <w:rPr>
+          <w:noProof/>
+        </w:rPr>
+        <w:t>(15)</w:t>
+      </w:r>
+      <w:r>
+        <w:fldChar w:fldCharType="end"/>
+      </w:r>
+      <w:r>
+        <w:t xml:space="preserve"> (version 0.10.0)</w:t>
+      </w:r>
+      <w:r>
+        <w:t xml:space="preserve">, spatialEco </w:t>
+      </w:r>
+      <w:r>
+        <w:fldChar w:fldCharType="begin"/>
+      </w:r>
+      <w:r>
+        <w:instrText xml:space="preserve"> ADDIN ZOTERO_ITEM CSL_CITATION {"citationID":"F0Txe0xs","properties":{"formattedCitation":"(16)","plainCitation":"(16)","noteIndex":0},"citationItems":[{"id":2890,"uris":["http://zotero.org/users/6391447/items/ST4LHMBV"],"itemData":{"id":2890,"type":"software","title":"spatialEco","version":"2.0-2","author":[{"family":"Evans","given":"Jeffrey S"},{"family":"Murphy","given":"Melanie A"}],"issued":{"date-parts":[["2023"]]}}}],"schema":"https://github.com/citation-style-language/schema/raw/master/csl-citation.json"} </w:instrText>
+      </w:r>
+      <w:r>
+        <w:fldChar w:fldCharType="separate"/>
+      </w:r>
+      <w:r>
+        <w:rPr>
+          <w:noProof/>
+        </w:rPr>
+        <w:t>(16)</w:t>
+      </w:r>
+      <w:r>
+        <w:fldChar w:fldCharType="end"/>
+      </w:r>
+      <w:r>
+        <w:t xml:space="preserve"> (version 2.0-2)</w:t>
+      </w:r>
+      <w:r>
+        <w:t xml:space="preserve">, nngeo </w:t>
+      </w:r>
+      <w:r>
+        <w:fldChar w:fldCharType="begin"/>
+      </w:r>
+      <w:r>
+        <w:instrText xml:space="preserve"> ADDIN ZOTERO_ITEM CSL_CITATION {"citationID":"AoPnjOVF","properties":{"formattedCitation":"(17)","plainCitation":"(17)","noteIndex":0},"citationItems":[{"id":2891,"uris":["http://zotero.org/users/6391447/items/JAZVYA8W"],"itemData":{"id":2891,"type":"dataset","DOI":"10.32614/cran.package.nngeo","note":"collection-title: CRAN: Contributed Packages","publisher":"The R Foundation","source":"Crossref","title":"nngeo: k-Nearest Neighbor Join for Spatial Data","title-short":"nngeo","URL":"https://CRAN.R-project.org/package=nngeo","author":[{"family":"Dorman","given":"Michael"}],"accessed":{"date-parts":[["2025",7,16]]},"issued":{"date-parts":[["2018",1,16]]}}}],"schema":"https://github.com/citation-style-language/schema/raw/master/csl-citation.json"} </w:instrText>
+      </w:r>
+      <w:r>
+        <w:fldChar w:fldCharType="separate"/>
+      </w:r>
+      <w:r>
+        <w:rPr>
+          <w:noProof/>
+        </w:rPr>
+        <w:t>(17)</w:t>
+      </w:r>
+      <w:r>
+        <w:fldChar w:fldCharType="end"/>
+      </w:r>
+      <w:r>
+        <w:t xml:space="preserve"> (version 0.4.8)</w:t>
+      </w:r>
+      <w:r>
+        <w:t xml:space="preserve">, auk </w:t>
+      </w:r>
+      <w:r>
+        <w:fldChar w:fldCharType="begin"/>
+      </w:r>
+      <w:r>
+        <w:instrText xml:space="preserve"> ADDIN ZOTERO_ITEM CSL_CITATION {"citationID":"ExXffuzp","properties":{"formattedCitation":"(18)","plainCitation":"(18)","noteIndex":0},"citationItems":[{"id":2893,"uris":["http://zotero.org/users/6391447/items/L83D3JCT"],"itemData":{"id":2893,"type":"dataset","DOI":"10.32614/cran.package.auk","note":"collection-title: CRAN: Contributed Packages","publisher":"The R Foundation","source":"Crossref","title":"auk: eBird Data Extraction and Processing in R","title-short":"auk","URL":"https://CRAN.R-project.org/package=auk","author":[{"family":"Strimas-Mackey","given":"Matthew"},{"family":"Miller","given":"Eliot"},{"family":"Hochachka","given":"Wesley"}],"accessed":{"date-parts":[["2025",7,16]]},"issued":{"date-parts":[["2017",7,5]]}}}],"schema":"https://github.com/citation-style-language/schema/raw/master/csl-citation.json"} </w:instrText>
+      </w:r>
+      <w:r>
+        <w:fldChar w:fldCharType="separate"/>
+      </w:r>
+      <w:r>
+        <w:rPr>
+          <w:noProof/>
+        </w:rPr>
+        <w:t>(18)</w:t>
+      </w:r>
+      <w:r>
+        <w:fldChar w:fldCharType="end"/>
+      </w:r>
+      <w:r>
+        <w:t xml:space="preserve"> (version 0.8.2)</w:t>
+      </w:r>
+      <w:r>
+        <w:t xml:space="preserve">, lubridate </w:t>
+      </w:r>
+      <w:r>
+        <w:fldChar w:fldCharType="begin"/>
+      </w:r>
+      <w:r>
+        <w:instrText xml:space="preserve"> ADDIN ZOTERO_ITEM CSL_CITATION {"citationID":"DGJUwaY3","properties":{"formattedCitation":"(19)","plainCitation":"(19)","noteIndex":0},"citationItems":[{"id":2895,"uris":["http://zotero.org/users/6391447/items/DX7GM6WB"],"itemData":{"id":2895,"type":"article-journal","container-title":"Journal of Statistical Software","DOI":"10.18637/jss.v040.i03","ISSN":"1548-7660","issue":"3","journalAbbreviation":"J. Stat. Soft.","language":"en","publisher":"Foundation for Open Access Statistic","source":"Crossref","title":"Dates and Times Made Easy with&lt;b&gt;lubridate&lt;/b&gt;","URL":"http://www.jstatsoft.org/v40/i03/","volume":"40","author":[{"family":"Grolemund","given":"Garrett"},{"family":"Wickham","given":"Hadley"}],"accessed":{"date-parts":[["2025",7,16]]},"issued":{"date-parts":[["2011"]]}}}],"schema":"https://github.com/citation-style-language/schema/raw/master/csl-citation.json"} </w:instrText>
+      </w:r>
+      <w:r>
+        <w:fldChar w:fldCharType="separate"/>
+      </w:r>
+      <w:r>
+        <w:rPr>
+          <w:noProof/>
+        </w:rPr>
+        <w:t>(19)</w:t>
+      </w:r>
+      <w:r>
+        <w:fldChar w:fldCharType="end"/>
+      </w:r>
+      <w:r>
+        <w:t xml:space="preserve"> (version 1.9.4)</w:t>
+      </w:r>
+      <w:r>
+        <w:t xml:space="preserve">, prism </w:t>
+      </w:r>
+      <w:r>
+        <w:fldChar w:fldCharType="begin"/>
+      </w:r>
+      <w:r>
+        <w:instrText xml:space="preserve"> ADDIN ZOTERO_ITEM CSL_CITATION {"citationID":"LlzPnLLP","properties":{"formattedCitation":"(20)","plainCitation":"(20)","noteIndex":0},"citationItems":[{"id":2896,"uris":["http://zotero.org/users/6391447/items/GFDELV22"],"itemData":{"id":2896,"type":"software","abstract":"Allows users to access the Oregon State Prism climate data. Using the webservice API data can easily downloaded in bulk and loaded into R for spatial analysis. Some user friendly visualizations are also provided.","DOI":"10.5281/ZENODO.33663","license":"MIT License, Open Access","publisher":"Zenodo","source":"DOI.org (Datacite)","title":"prism: Access data from the Oregon State Prism climate project","title-short":"prism","URL":"https://zenodo.org/record/33663","author":[{"family":"Hart","given":"Edmund"},{"family":"Bell","given":"Kendon"}],"accessed":{"date-parts":[["2025",7,16]]},"issued":{"date-parts":[["2015",11,12]]}}}],"schema":"https://github.com/citation-style-language/schema/raw/master/csl-citation.json"} </w:instrText>
+      </w:r>
+      <w:r>
+        <w:fldChar w:fldCharType="separate"/>
+      </w:r>
+      <w:r>
+        <w:rPr>
+          <w:noProof/>
+        </w:rPr>
+        <w:t>(20)</w:t>
+      </w:r>
+      <w:r>
+        <w:fldChar w:fldCharType="end"/>
+      </w:r>
+      <w:r>
+        <w:t xml:space="preserve"> (version 0.0.6)</w:t>
+      </w:r>
+      <w:r>
+        <w:t xml:space="preserve">, FNN </w:t>
+      </w:r>
+      <w:r>
+        <w:fldChar w:fldCharType="begin"/>
+      </w:r>
+      <w:r>
+        <w:instrText xml:space="preserve"> ADDIN ZOTERO_ITEM CSL_CITATION {"citationID":"V39kabav","properties":{"formattedCitation":"(21)","plainCitation":"(21)","noteIndex":0},"citationItems":[{"id":2897,"uris":["http://zotero.org/users/6391447/items/986APTZN"],"itemData":{"id":2897,"type":"dataset","DOI":"10.32614/cran.package.fnn","note":"collection-title: CRAN: Contributed Packages","publisher":"The R Foundation","source":"Crossref","title":"FNN: Fast Nearest Neighbor Search Algorithms and Applications","title-short":"FNN","URL":"https://CRAN.R-project.org/package=FNN","author":[{"family":"Beygelzimer","given":"Alina"},{"family":"Kakadet","given":"Sham"},{"family":"Langford","given":"John"},{"family":"Arya","given":"Sunil"},{"family":"Mount","given":"David"},{"family":"Li","given":"Shengqiao"}],"accessed":{"date-parts":[["2025",7,16]]},"issued":{"date-parts":[["2010",3,17]]}}}],"schema":"https://github.com/citation-style-language/schema/raw/master/csl-citation.json"} </w:instrText>
+      </w:r>
+      <w:r>
+        <w:fldChar w:fldCharType="separate"/>
+      </w:r>
+      <w:r>
+        <w:rPr>
+          <w:noProof/>
+        </w:rPr>
+        <w:t>(21)</w:t>
+      </w:r>
+      <w:r>
+        <w:fldChar w:fldCharType="end"/>
+      </w:r>
+      <w:r>
+        <w:t xml:space="preserve"> (version 1.1.4.1)</w:t>
+      </w:r>
+      <w:r>
+        <w:t xml:space="preserve">, and data.table </w:t>
+      </w:r>
+      <w:r>
+        <w:fldChar w:fldCharType="begin"/>
+      </w:r>
+      <w:r>
+        <w:instrText xml:space="preserve"> ADDIN ZOTERO_ITEM CSL_CITATION {"citationID":"W2WwfJbF","properties":{"formattedCitation":"(22)","plainCitation":"(22)","noteIndex":0},"citationItems":[{"id":2817,"uris":["http://zotero.org/users/6391447/items/G7RZHXS7"],"itemData":{"id":2817,"type":"dataset","DOI":"10.32614/cran.package.data.table","note":"collection-title: CRAN: Contributed Packages","publisher":"The R Foundation","source":"Crossref","title":"data.table: Extension of `data.frame`","title-short":"data.table","URL":"https://CRAN.R-project.org/package=data.table","author":[{"family":"Barrett","given":"Tyson"},{"family":"Dowle","given":"Matt"},{"family":"Srinivasan","given":"Arun"},{"family":"Gorecki","given":"Jan"},{"family":"Chirico","given":"Michael"},{"family":"Hocking","given":"Toby"},{"family":"Schwendinger","given":"Benjamin"},{"family":"Krylov","given":"Ivan"}],"accessed":{"date-parts":[["2025",7,7]]},"issued":{"date-parts":[["2006",4,15]]}}}],"schema":"https://github.com/citation-style-language/schema/raw/master/csl-citation.json"} </w:instrText>
+      </w:r>
+      <w:r>
+        <w:fldChar w:fldCharType="separate"/>
+      </w:r>
+      <w:r>
+        <w:rPr>
+          <w:noProof/>
+        </w:rPr>
+        <w:t>(22)</w:t>
+      </w:r>
+      <w:r>
+        <w:fldChar w:fldCharType="end"/>
+      </w:r>
       <w:r>
         <w:t xml:space="preserve"> </w:t>
       </w:r>
       <w:r>
-        <w:fldChar w:fldCharType="begin"/>
-      </w:r>
-      <w:r>
-        <w:instrText xml:space="preserve"> ADDIN ZOTERO_ITEM CSL_CITATION {"citationID":"jDQX3ElH","properties":{"formattedCitation":"(Wickham et al., 2019)","plainCitation":"(Wickham et al., 2019)","dontUpdate":true,"noteIndex":0},"citationItems":[{"id":103,"uris":["http://zotero.org/users/6391447/items/Z5MZP2MP"],"itemData":{"id":103,"type":"article-journal","abstract":"At a high level, the tidyverse is a language for solving data science challenges with R code. Its primary goal is to facilitate a conversation between a human and a computer about data. Less abstractly, the tidyverse is a collection of R packages that share a high-level design philosophy and low-level grammar and data structures, so that learning one package makes it easier to learn the next.","container-title":"Journal of Open Source Software","DOI":"10.21105/joss.01686","ISSN":"2475-9066","issue":"43","journalAbbreviation":"JOSS","language":"en","page":"1686","source":"DOI.org (Crossref)","title":"Welcome to the Tidyverse","volume":"4","author":[{"family":"Wickham","given":"Hadley"},{"family":"Averick","given":"Mara"},{"family":"Bryan","given":"Jennifer"},{"family":"Chang","given":"Winston"},{"family":"McGowan","given":"Lucy"},{"family":"François","given":"Romain"},{"family":"Grolemund","given":"Garrett"},{"family":"Hayes","given":"Alex"},{"family":"Henry","given":"Lionel"},{"family":"Hester","given":"Jim"},{"family":"Kuhn","given":"Max"},{"family":"Pedersen","given":"Thomas"},{"family":"Miller","given":"Evan"},{"family":"Bache","given":"Stephan"},{"family":"Müller","given":"Kirill"},{"family":"Ooms","given":"Jeroen"},{"family":"Robinson","given":"David"},{"family":"Seidel","given":"Dana"},{"family":"Spinu","given":"Vitalie"},{"family":"Takahashi","given":"Kohske"},{"family":"Vaughan","given":"Davis"},{"family":"Wilke","given":"Claus"},{"family":"Woo","given":"Kara"},{"family":"Yutani","given":"Hiroaki"}],"issued":{"date-parts":[["2019",11,21]]}}}],"schema":"https://github.com/citation-style-language/schema/raw/master/csl-citation.json"} </w:instrText>
-      </w:r>
-      <w:r>
-        <w:fldChar w:fldCharType="separate"/>
-      </w:r>
-      <w:r>
-        <w:rPr>
-          <w:noProof/>
-        </w:rPr>
-        <w:t>(Wickham et al., 2019, version 2.0.0)</w:t>
-      </w:r>
-      <w:r>
-        <w:fldChar w:fldCharType="end"/>
-      </w:r>
-      <w:r>
-        <w:t xml:space="preserve">, sf </w:t>
-      </w:r>
-      <w:r>
-        <w:fldChar w:fldCharType="begin"/>
-      </w:r>
-      <w:r>
-        <w:instrText xml:space="preserve"> ADDIN ZOTERO_ITEM CSL_CITATION {"citationID":"NjWnVWRa","properties":{"formattedCitation":"(Pebesma &amp; Bivand, 2023)","plainCitation":"(Pebesma &amp; Bivand, 2023)","dontUpdate":true,"noteIndex":0},"citationItems":[{"id":2884,"uris":["http://zotero.org/groups/5634119/items/R9PIG4SB"],"itemData":{"id":2884,"type":"book","edition":"1","event-place":"New York","ISBN":"978-0-429-45901-6","language":"en","note":"DOI: 10.1201/9780429459016","publisher":"Chapman and Hall/CRC","publisher-place":"New York","source":"Crossref","title":"Spatial Data Science: With Applications in R","title-short":"Spatial Data Science","URL":"https://www.taylorfrancis.com/books/9780429459016","author":[{"family":"Pebesma","given":"Edzer"},{"family":"Bivand","given":"Roger"}],"accessed":{"date-parts":[["2025",7,16]]},"issued":{"date-parts":[["2023",5,10]]}}}],"schema":"https://github.com/citation-style-language/schema/raw/master/csl-citation.json"} </w:instrText>
-      </w:r>
-      <w:r>
-        <w:fldChar w:fldCharType="separate"/>
-      </w:r>
-      <w:r>
-        <w:rPr>
-          <w:noProof/>
-        </w:rPr>
-        <w:t>(Pebesma &amp; Bivand, 2023, version 1.0.21)</w:t>
-      </w:r>
-      <w:r>
-        <w:fldChar w:fldCharType="end"/>
-      </w:r>
-      <w:r>
-        <w:t xml:space="preserve">, terra </w:t>
-      </w:r>
-      <w:r>
-        <w:fldChar w:fldCharType="begin"/>
-      </w:r>
-      <w:r>
-        <w:instrText xml:space="preserve"> ADDIN ZOTERO_ITEM CSL_CITATION {"citationID":"VKB8UVpX","properties":{"formattedCitation":"(Hijmans, 2020)","plainCitation":"(Hijmans, 2020)","dontUpdate":true,"noteIndex":0},"citationItems":[{"id":2885,"uris":["http://zotero.org/groups/5634119/items/7HSV3ZUH"],"itemData":{"id":2885,"type":"dataset","DOI":"10.32614/cran.package.terra","note":"collection-title: CRAN: Contributed Packages","publisher":"The R Foundation","source":"Crossref","title":"terra: Spatial Data Analysis","title-short":"terra","URL":"https://CRAN.R-project.org/package=terra","author":[{"family":"Hijmans","given":"Robert J."}],"accessed":{"date-parts":[["2025",7,16]]},"issued":{"date-parts":[["2020",3,20]]}}}],"schema":"https://github.com/citation-style-language/schema/raw/master/csl-citation.json"} </w:instrText>
-      </w:r>
-      <w:r>
-        <w:fldChar w:fldCharType="separate"/>
-      </w:r>
-      <w:r>
-        <w:rPr>
-          <w:noProof/>
-        </w:rPr>
-        <w:t>(Hijmans, 2020, version 1.8.54)</w:t>
-      </w:r>
-      <w:r>
-        <w:fldChar w:fldCharType="end"/>
-      </w:r>
-      <w:r>
-        <w:t xml:space="preserve">, </w:t>
-      </w:r>
-      <w:proofErr w:type="spellStart"/>
-      <w:r>
-        <w:t>readxl</w:t>
-      </w:r>
-      <w:proofErr w:type="spellEnd"/>
-      <w:r>
-        <w:t xml:space="preserve"> </w:t>
-      </w:r>
-      <w:r>
-        <w:fldChar w:fldCharType="begin"/>
-      </w:r>
-      <w:r>
-        <w:instrText xml:space="preserve"> ADDIN ZOTERO_ITEM CSL_CITATION {"citationID":"92lam9QR","properties":{"formattedCitation":"(Wickham &amp; Bryan, 2015)","plainCitation":"(Wickham &amp; Bryan, 2015)","dontUpdate":true,"noteIndex":0},"citationItems":[{"id":2745,"uris":["http://zotero.org/users/6391447/items/IBQSLUBY"],"itemData":{"id":2745,"type":"dataset","abstract":"Import excel files into R. Supports '.xls' via the embedded 'libxls' C library &lt;https://github.com/libxls/libxls&gt; and '.xlsx' via the embedded 'RapidXML' C++ library &lt;https://rapidxml.sourceforge.net/&gt;. Works on Windows, Mac and Linux without external dependencies.","DOI":"10.32614/CRAN.package.readxl","language":"en","note":"Institution: Comprehensive R Archive Network\npage: 1.4.3","source":"DOI.org (Crossref)","title":"readxl: Read Excel Files","title-short":"readxl","URL":"https://CRAN.R-project.org/package=readxl","author":[{"family":"Wickham","given":"Hadley"},{"family":"Bryan","given":"Jennifer"}],"accessed":{"date-parts":[["2025",2,24]]},"issued":{"date-parts":[["2015",4,14]]}}}],"schema":"https://github.com/citation-style-language/schema/raw/master/csl-citation.json"} </w:instrText>
-      </w:r>
-      <w:r>
-        <w:fldChar w:fldCharType="separate"/>
-      </w:r>
-      <w:r>
-        <w:rPr>
-          <w:noProof/>
-        </w:rPr>
-        <w:t>(Wickham &amp; Bryan, 2015, version 1.4.5)</w:t>
-      </w:r>
-      <w:r>
-        <w:fldChar w:fldCharType="end"/>
-      </w:r>
-      <w:r>
-        <w:t xml:space="preserve">, </w:t>
-      </w:r>
-      <w:proofErr w:type="spellStart"/>
-      <w:r>
-        <w:t>exactextractr</w:t>
-      </w:r>
-      <w:proofErr w:type="spellEnd"/>
-      <w:r>
-        <w:t xml:space="preserve"> </w:t>
-      </w:r>
-      <w:r>
-        <w:fldChar w:fldCharType="begin"/>
-      </w:r>
-      <w:r>
-        <w:instrText xml:space="preserve"> ADDIN ZOTERO_ITEM CSL_CITATION {"citationID":"z3f7F387","properties":{"formattedCitation":"(Daniel Baston, 2019)","plainCitation":"(Daniel Baston, 2019)","dontUpdate":true,"noteIndex":0},"citationItems":[{"id":2887,"uris":["http://zotero.org/users/6391447/items/E2DRXRIV"],"itemData":{"id":2887,"type":"dataset","DOI":"10.32614/cran.package.exactextractr","note":"collection-title: CRAN: Contributed Packages","publisher":"The R Foundation","source":"Crossref","title":"exactextractr: Fast Extraction from Raster Datasets using Polygons","title-short":"exactextractr","URL":"https://CRAN.R-project.org/package=exactextractr","author":[{"literal":"Daniel Baston"}],"accessed":{"date-parts":[["2025",7,16]]},"issued":{"date-parts":[["2019",8,1]]}}}],"schema":"https://github.com/citation-style-language/schema/raw/master/csl-citation.json"} </w:instrText>
-      </w:r>
-      <w:r>
-        <w:fldChar w:fldCharType="separate"/>
-      </w:r>
-      <w:r>
-        <w:rPr>
-          <w:noProof/>
-        </w:rPr>
-        <w:t>(Daniel Baston, 2019, version 0.10.0)</w:t>
-      </w:r>
-      <w:r>
-        <w:fldChar w:fldCharType="end"/>
-      </w:r>
-      <w:r>
-        <w:t xml:space="preserve">, </w:t>
-      </w:r>
-      <w:proofErr w:type="spellStart"/>
-      <w:r>
-        <w:t>spatialEco</w:t>
-      </w:r>
-      <w:proofErr w:type="spellEnd"/>
-      <w:r>
-        <w:t xml:space="preserve"> </w:t>
-      </w:r>
-      <w:r>
-        <w:fldChar w:fldCharType="begin"/>
-      </w:r>
-      <w:r>
-        <w:instrText xml:space="preserve"> ADDIN ZOTERO_ITEM CSL_CITATION {"citationID":"UBNSVsAy","properties":{"formattedCitation":"(Evans &amp; Murphy, 2023)","plainCitation":"(Evans &amp; Murphy, 2023)","dontUpdate":true,"noteIndex":0},"citationItems":[{"id":2890,"uris":["http://zotero.org/users/6391447/items/ST4LHMBV"],"itemData":{"id":2890,"type":"software","title":"spatialEco","version":"2.0-2","author":[{"family":"Evans","given":"Jeffrey S"},{"family":"Murphy","given":"Melanie A"}],"issued":{"date-parts":[["2023"]]}}}],"schema":"https://github.com/citation-style-language/schema/raw/master/csl-citation.json"} </w:instrText>
-      </w:r>
-      <w:r>
-        <w:fldChar w:fldCharType="separate"/>
-      </w:r>
-      <w:r>
-        <w:rPr>
-          <w:noProof/>
-        </w:rPr>
-        <w:t>(Evans &amp; Murphy, 2023, version 2.0-2)</w:t>
-      </w:r>
-      <w:r>
-        <w:fldChar w:fldCharType="end"/>
-      </w:r>
-      <w:r>
-        <w:t xml:space="preserve">, </w:t>
-      </w:r>
-      <w:proofErr w:type="spellStart"/>
-      <w:r>
-        <w:t>nngeo</w:t>
-      </w:r>
-      <w:proofErr w:type="spellEnd"/>
-      <w:r>
-        <w:t xml:space="preserve"> </w:t>
-      </w:r>
-      <w:r>
-        <w:fldChar w:fldCharType="begin"/>
-      </w:r>
-      <w:r>
-        <w:instrText xml:space="preserve"> ADDIN ZOTERO_ITEM CSL_CITATION {"citationID":"jEIMje0w","properties":{"formattedCitation":"(Dorman, 2018)","plainCitation":"(Dorman, 2018)","dontUpdate":true,"noteIndex":0},"citationItems":[{"id":2891,"uris":["http://zotero.org/users/6391447/items/JAZVYA8W"],"itemData":{"id":2891,"type":"dataset","DOI":"10.32614/cran.package.nngeo","note":"collection-title: CRAN: Contributed Packages","publisher":"The R Foundation","source":"Crossref","title":"nngeo: k-Nearest Neighbor Join for Spatial Data","title-short":"nngeo","URL":"https://CRAN.R-project.org/package=nngeo","author":[{"family":"Dorman","given":"Michael"}],"accessed":{"date-parts":[["2025",7,16]]},"issued":{"date-parts":[["2018",1,16]]}}}],"schema":"https://github.com/citation-style-language/schema/raw/master/csl-citation.json"} </w:instrText>
-      </w:r>
-      <w:r>
-        <w:fldChar w:fldCharType="separate"/>
-      </w:r>
-      <w:r>
-        <w:rPr>
-          <w:noProof/>
-        </w:rPr>
-        <w:t>(Dorman, 2018, version 0.4.8)</w:t>
-      </w:r>
-      <w:r>
-        <w:fldChar w:fldCharType="end"/>
-      </w:r>
-      <w:r>
-        <w:t xml:space="preserve">, auk </w:t>
-      </w:r>
-      <w:r>
-        <w:fldChar w:fldCharType="begin"/>
-      </w:r>
-      <w:r>
-        <w:instrText xml:space="preserve"> ADDIN ZOTERO_ITEM CSL_CITATION {"citationID":"gsLo05wM","properties":{"formattedCitation":"(Strimas-Mackey et al., 2017)","plainCitation":"(Strimas-Mackey et al., 2017)","dontUpdate":true,"noteIndex":0},"citationItems":[{"id":2893,"uris":["http://zotero.org/users/6391447/items/L83D3JCT"],"itemData":{"id":2893,"type":"dataset","DOI":"10.32614/cran.package.auk","note":"collection-title: CRAN: Contributed Packages","publisher":"The R Foundation","source":"Crossref","title":"auk: eBird Data Extraction and Processing in R","title-short":"auk","URL":"https://CRAN.R-project.org/package=auk","author":[{"family":"Strimas-Mackey","given":"Matthew"},{"family":"Miller","given":"Eliot"},{"family":"Hochachka","given":"Wesley"}],"accessed":{"date-parts":[["2025",7,16]]},"issued":{"date-parts":[["2017",7,5]]}}}],"schema":"https://github.com/citation-style-language/schema/raw/master/csl-citation.json"} </w:instrText>
-      </w:r>
-      <w:r>
-        <w:fldChar w:fldCharType="separate"/>
-      </w:r>
-      <w:r>
-        <w:rPr>
-          <w:noProof/>
-        </w:rPr>
-        <w:t>(Strimas-Mackey et al., 2017, version 0.8.2)</w:t>
-      </w:r>
-      <w:r>
-        <w:fldChar w:fldCharType="end"/>
-      </w:r>
-      <w:r>
-        <w:t xml:space="preserve">, </w:t>
-      </w:r>
-      <w:proofErr w:type="spellStart"/>
-      <w:r>
-        <w:t>lubridate</w:t>
-      </w:r>
-      <w:proofErr w:type="spellEnd"/>
-      <w:r>
-        <w:t xml:space="preserve"> </w:t>
-      </w:r>
-      <w:r>
-        <w:fldChar w:fldCharType="begin"/>
-      </w:r>
-      <w:r>
-        <w:instrText xml:space="preserve"> ADDIN ZOTERO_ITEM CSL_CITATION {"citationID":"gYbIPxjJ","properties":{"formattedCitation":"(Grolemund &amp; Wickham, 2011)","plainCitation":"(Grolemund &amp; Wickham, 2011)","dontUpdate":true,"noteIndex":0},"citationItems":[{"id":2895,"uris":["http://zotero.org/users/6391447/items/DX7GM6WB"],"itemData":{"id":2895,"type":"article-journal","container-title":"Journal of Statistical Software","DOI":"10.18637/jss.v040.i03","ISSN":"1548-7660","issue":"3","journalAbbreviation":"J. Stat. Soft.","language":"en","note":"publisher: Foundation for Open Access Statistic","source":"Crossref","title":"Dates and Times Made Easy with&lt;b&gt;lubridate&lt;/b&gt;","URL":"http://www.jstatsoft.org/v40/i03/","volume":"40","author":[{"family":"Grolemund","given":"Garrett"},{"family":"Wickham","given":"Hadley"}],"accessed":{"date-parts":[["2025",7,16]]},"issued":{"date-parts":[["2011"]]}}}],"schema":"https://github.com/citation-style-language/schema/raw/master/csl-citation.json"} </w:instrText>
-      </w:r>
-      <w:r>
-        <w:fldChar w:fldCharType="separate"/>
-      </w:r>
-      <w:r>
-        <w:rPr>
-          <w:noProof/>
-        </w:rPr>
-        <w:t>(Grolemund &amp; Wickham, 2011, version 1.9.4)</w:t>
-      </w:r>
-      <w:r>
-        <w:fldChar w:fldCharType="end"/>
-      </w:r>
-      <w:r>
-        <w:t xml:space="preserve">, prism </w:t>
-      </w:r>
-      <w:r>
-        <w:fldChar w:fldCharType="begin"/>
-      </w:r>
-      <w:r>
-        <w:instrText xml:space="preserve"> ADDIN ZOTERO_ITEM CSL_CITATION {"citationID":"smccobBF","properties":{"formattedCitation":"(Hart &amp; Bell, 2015)","plainCitation":"(Hart &amp; Bell, 2015)","dontUpdate":true,"noteIndex":0},"citationItems":[{"id":2896,"uris":["http://zotero.org/users/6391447/items/GFDELV22"],"itemData":{"id":2896,"type":"software","abstract":"Allows users to access the Oregon State Prism climate data. Using the webservice API data can easily downloaded in bulk and loaded into R for spatial analysis. Some user friendly visualizations are also provided.","license":"MIT License, Open Access","note":"DOI: 10.5281/ZENODO.33663","publisher":"Zenodo","source":"DOI.org (Datacite)","title":"prism: Access data from the Oregon State Prism climate project","title-short":"prism","URL":"https://zenodo.org/record/33663","author":[{"family":"Hart","given":"Edmund"},{"family":"Bell","given":"Kendon"}],"accessed":{"date-parts":[["2025",7,16]]},"issued":{"date-parts":[["2015",11,12]]}}}],"schema":"https://github.com/citation-style-language/schema/raw/master/csl-citation.json"} </w:instrText>
-      </w:r>
-      <w:r>
-        <w:fldChar w:fldCharType="separate"/>
-      </w:r>
-      <w:r>
-        <w:rPr>
-          <w:noProof/>
-        </w:rPr>
-        <w:t>(Hart &amp; Bell, 2015, version 0.0.6)</w:t>
-      </w:r>
-      <w:r>
-        <w:fldChar w:fldCharType="end"/>
-      </w:r>
-      <w:r>
-        <w:t xml:space="preserve">, FNN </w:t>
-      </w:r>
-      <w:r>
-        <w:fldChar w:fldCharType="begin"/>
-      </w:r>
-      <w:r>
-        <w:instrText xml:space="preserve"> ADDIN ZOTERO_ITEM CSL_CITATION {"citationID":"2atpAqRi","properties":{"formattedCitation":"(Beygelzimer et al., 2010)","plainCitation":"(Beygelzimer et al., 2010)","dontUpdate":true,"noteIndex":0},"citationItems":[{"id":2897,"uris":["http://zotero.org/users/6391447/items/986APTZN"],"itemData":{"id":2897,"type":"dataset","DOI":"10.32614/cran.package.fnn","note":"collection-title: CRAN: Contributed Packages","publisher":"The R Foundation","source":"Crossref","title":"FNN: Fast Nearest Neighbor Search Algorithms and Applications","title-short":"FNN","URL":"https://CRAN.R-project.org/package=FNN","author":[{"family":"Beygelzimer","given":"Alina"},{"family":"Kakadet","given":"Sham"},{"family":"Langford","given":"John"},{"family":"Arya","given":"Sunil"},{"family":"Mount","given":"David"},{"family":"Li","given":"Shengqiao"}],"accessed":{"date-parts":[["2025",7,16]]},"issued":{"date-parts":[["2010",3,17]]}}}],"schema":"https://github.com/citation-style-language/schema/raw/master/csl-citation.json"} </w:instrText>
-      </w:r>
-      <w:r>
-        <w:fldChar w:fldCharType="separate"/>
-      </w:r>
-      <w:r>
-        <w:rPr>
-          <w:noProof/>
-        </w:rPr>
-        <w:t>(Beygelzimer et al., 2010, version 1.1.4.1)</w:t>
-      </w:r>
-      <w:r>
-        <w:fldChar w:fldCharType="end"/>
-      </w:r>
-      <w:r>
-        <w:t xml:space="preserve">, and </w:t>
-      </w:r>
-      <w:proofErr w:type="spellStart"/>
-      <w:r>
-        <w:t>data.table</w:t>
-      </w:r>
-      <w:proofErr w:type="spellEnd"/>
-      <w:r>
-        <w:t xml:space="preserve"> </w:t>
-      </w:r>
-      <w:r>
-        <w:fldChar w:fldCharType="begin"/>
-      </w:r>
-      <w:r>
-        <w:instrText xml:space="preserve"> ADDIN ZOTERO_ITEM CSL_CITATION {"citationID":"kaFAuBDu","properties":{"formattedCitation":"(Barrett et al., 2006)","plainCitation":"(Barrett et al., 2006)","dontUpdate":true,"noteIndex":0},"citationItems":[{"id":2817,"uris":["http://zotero.org/users/6391447/items/G7RZHXS7"],"itemData":{"id":2817,"type":"dataset","DOI":"10.32614/cran.package.data.table","note":"collection-title: CRAN: Contributed Packages","publisher":"The R Foundation","source":"Crossref","title":"data.table: Extension of `data.frame`","title-short":"data.table","URL":"https://CRAN.R-project.org/package=data.table","author":[{"family":"Barrett","given":"Tyson"},{"family":"Dowle","given":"Matt"},{"family":"Srinivasan","given":"Arun"},{"family":"Gorecki","given":"Jan"},{"family":"Chirico","given":"Michael"},{"family":"Hocking","given":"Toby"},{"family":"Schwendinger","given":"Benjamin"},{"family":"Krylov","given":"Ivan"}],"accessed":{"date-parts":[["2025",7,7]]},"issued":{"date-parts":[["2006",4,15]]}}}],"schema":"https://github.com/citation-style-language/schema/raw/master/csl-citation.json"} </w:instrText>
-      </w:r>
-      <w:r>
-        <w:fldChar w:fldCharType="separate"/>
-      </w:r>
-      <w:r>
-        <w:rPr>
-          <w:noProof/>
-        </w:rPr>
-        <w:t>(Barrett et al., 2006, version 1.17.6)</w:t>
-      </w:r>
-      <w:r>
-        <w:fldChar w:fldCharType="end"/>
-      </w:r>
-      <w:r>
-        <w:t xml:space="preserve"> packages.</w:t>
+        <w:t xml:space="preserve">(version 1.17.6) </w:t>
+      </w:r>
+      <w:r>
+        <w:t>packages.</w:t>
       </w:r>
     </w:p>
     <w:p>
@@ -1052,10 +1002,10 @@
         <w:t xml:space="preserve"> 1.1 </w:t>
       </w:r>
       <w:r>
-        <w:t>(SI Figure</w:t>
-      </w:r>
-      <w:r>
-        <w:t xml:space="preserve"> 3</w:t>
+        <w:t>(</w:t>
+      </w:r>
+      <w:r>
+        <w:t>Fig. S3</w:t>
       </w:r>
       <w:r>
         <w:t xml:space="preserve">). </w:t>
@@ -1076,11 +1026,7 @@
         <w:t xml:space="preserve">yielded </w:t>
       </w:r>
       <w:r>
-        <w:t xml:space="preserve">a </w:t>
-      </w:r>
-      <w:commentRangeStart w:id="0"/>
-      <w:r>
-        <w:t xml:space="preserve">mean </w:t>
+        <w:t xml:space="preserve">a mean </w:t>
       </w:r>
       <w:r>
         <w:rPr>
@@ -1096,27 +1042,31 @@
         <w:t>2</w:t>
       </w:r>
       <w:r>
-        <w:t xml:space="preserve"> of 0.74 (s.e. </w:t>
+        <w:t xml:space="preserve"> of 0.</w:t>
+      </w:r>
+      <w:r>
+        <w:t>17</w:t>
+      </w:r>
+      <w:r>
+        <w:t xml:space="preserve"> (s.e. </w:t>
       </w:r>
       <w:r>
         <w:t xml:space="preserve">= </w:t>
       </w:r>
       <w:r>
-        <w:t xml:space="preserve">0.0003). </w:t>
-      </w:r>
-      <w:commentRangeEnd w:id="0"/>
-      <w:r>
-        <w:rPr>
-          <w:rStyle w:val="CommentReference"/>
-          <w:rFonts w:asciiTheme="minorHAnsi" w:hAnsiTheme="minorHAnsi"/>
-        </w:rPr>
-        <w:commentReference w:id="0"/>
-      </w:r>
-      <w:r>
-        <w:t xml:space="preserve">In </w:t>
-      </w:r>
-      <w:r>
-        <w:t xml:space="preserve">general, the model under-estimated the highest </w:t>
+        <w:t>0.00</w:t>
+      </w:r>
+      <w:r>
+        <w:t>5</w:t>
+      </w:r>
+      <w:r>
+        <w:t xml:space="preserve">). In </w:t>
+      </w:r>
+      <w:r>
+        <w:t xml:space="preserve">general, the model </w:t>
+      </w:r>
+      <w:r>
+        <w:t xml:space="preserve">over-estimated small </w:t>
       </w:r>
       <w:r>
         <w:t xml:space="preserve">pinyon jay </w:t>
@@ -1125,25 +1075,17 @@
         <w:t>counts but performed well for most other values (</w:t>
       </w:r>
       <w:r>
-        <w:t>SI Figure</w:t>
-      </w:r>
-      <w:r>
-        <w:t xml:space="preserve"> 4</w:t>
+        <w:t>Fig. S4</w:t>
       </w:r>
       <w:r>
         <w:t>). The</w:t>
       </w:r>
       <w:r>
-        <w:t xml:space="preserve"> RMSE for our in-sample dataset had an average value of 3.25 (</w:t>
-      </w:r>
-      <w:proofErr w:type="spellStart"/>
-      <w:r>
-        <w:t>s.e</w:t>
+        <w:t xml:space="preserve"> RMSE for our in-sample dataset had an average value of 3.25 (s.e</w:t>
       </w:r>
       <w:r>
         <w:t>.</w:t>
       </w:r>
-      <w:proofErr w:type="spellEnd"/>
       <w:r>
         <w:t xml:space="preserve"> =</w:t>
       </w:r>
@@ -1151,16 +1093,11 @@
         <w:t xml:space="preserve"> </w:t>
       </w:r>
       <w:r>
-        <w:t>0.001) and the out-of-sample dataset had a value of 5.10 (</w:t>
-      </w:r>
-      <w:proofErr w:type="spellStart"/>
-      <w:r>
-        <w:t>s.e</w:t>
+        <w:t>0.001) and the out-of-sample dataset had a value of 5.10 (s.e</w:t>
       </w:r>
       <w:r>
         <w:t>.</w:t>
       </w:r>
-      <w:proofErr w:type="spellEnd"/>
       <w:r>
         <w:t xml:space="preserve"> =</w:t>
       </w:r>
@@ -1171,7 +1108,7 @@
         <w:t xml:space="preserve">0.0002; </w:t>
       </w:r>
       <w:r>
-        <w:t xml:space="preserve">SI Figure </w:t>
+        <w:t>Fig. S</w:t>
       </w:r>
       <w:r>
         <w:t>5</w:t>
@@ -1180,52 +1117,52 @@
         <w:t>). Thus</w:t>
       </w:r>
       <w:r>
-        <w:t xml:space="preserve">, our </w:t>
-      </w:r>
-      <w:r>
+        <w:t xml:space="preserve">, our model predicted our in-sample data slightly better than the out-of-sample data, but neither RMSE values are large considering the scale of the count data (counts per checklist ranged from 0 to 350), suggesting good model fit and predictive capacity. We observed no </w:t>
+      </w:r>
+      <w:r>
+        <w:t>evidence for</w:t>
+      </w:r>
+      <w:r>
+        <w:t xml:space="preserve"> </w:t>
+      </w:r>
+      <w:r>
+        <w:t xml:space="preserve">strong or consistent </w:t>
+      </w:r>
+      <w:r>
+        <w:t>spatial autocorrelation in</w:t>
+      </w:r>
+      <w:r>
+        <w:t xml:space="preserve"> model</w:t>
+      </w:r>
+      <w:r>
+        <w:t xml:space="preserve"> residuals (</w:t>
+      </w:r>
+      <w:r>
+        <w:t xml:space="preserve">Fig. S6 </w:t>
+      </w:r>
+      <w:r>
+        <w:t>SI</w:t>
+      </w:r>
+      <w:r>
+        <w:t>)</w:t>
+      </w:r>
+      <w:r>
+        <w:t>.</w:t>
+      </w:r>
+      <w:r>
+        <w:t xml:space="preserve"> </w:t>
+      </w:r>
+    </w:p>
+    <w:p>
+      <w:pPr>
+        <w:pStyle w:val="BodyText"/>
+      </w:pPr>
+      <w:r>
+        <w:rPr>
+          <w:b/>
+          <w:bCs/>
+        </w:rPr>
         <w:lastRenderedPageBreak/>
-        <w:t xml:space="preserve">model predicted our in-sample data slightly better than the out-of-sample data, but neither RMSE values are large considering the scale of the count data (counts per checklist ranged from 0 to 350), suggesting good model fit and predictive capacity. We observed no </w:t>
-      </w:r>
-      <w:r>
-        <w:t>evidence for</w:t>
-      </w:r>
-      <w:r>
-        <w:t xml:space="preserve"> </w:t>
-      </w:r>
-      <w:r>
-        <w:t xml:space="preserve">strong or consistent </w:t>
-      </w:r>
-      <w:r>
-        <w:t>spatial autocorrelation in</w:t>
-      </w:r>
-      <w:r>
-        <w:t xml:space="preserve"> model</w:t>
-      </w:r>
-      <w:r>
-        <w:t xml:space="preserve"> residuals (</w:t>
-      </w:r>
-      <w:r>
-        <w:t>SI Figure</w:t>
-      </w:r>
-      <w:r>
-        <w:t xml:space="preserve"> 6)</w:t>
-      </w:r>
-      <w:r>
-        <w:t>.</w:t>
-      </w:r>
-      <w:r>
-        <w:t xml:space="preserve"> </w:t>
-      </w:r>
-    </w:p>
-    <w:p>
-      <w:pPr>
-        <w:pStyle w:val="BodyText"/>
-      </w:pPr>
-      <w:r>
-        <w:rPr>
-          <w:b/>
-          <w:bCs/>
-        </w:rPr>
         <w:t xml:space="preserve">Covariates </w:t>
       </w:r>
       <w:r>
@@ -1379,7 +1316,7 @@
                     </pic:cNvPicPr>
                   </pic:nvPicPr>
                   <pic:blipFill>
-                    <a:blip r:embed="rId8"/>
+                    <a:blip r:embed="rId5"/>
                     <a:stretch>
                       <a:fillRect/>
                     </a:stretch>
@@ -1415,16 +1352,13 @@
           <w:b/>
           <w:bCs/>
         </w:rPr>
-        <w:t>SI Figure 1.</w:t>
-      </w:r>
-      <w:r>
-        <w:t xml:space="preserve"> Posterior</w:t>
-      </w:r>
-      <w:r>
-        <w:t xml:space="preserve"> estimates (median and 95% CI) for the seasonal importance weights for climate (precipitation and maximum </w:t>
-      </w:r>
-      <w:r>
-        <w:t xml:space="preserve">temperature; </w:t>
+        <w:t>Fig. S1.</w:t>
+      </w:r>
+      <w:r>
+        <w:t>Posterior</w:t>
+      </w:r>
+      <w:r>
+        <w:t xml:space="preserve"> estimates (median and 95% CI) for the seasonal importance weights for climate (precipitation and maximum temperature; </w:t>
       </w:r>
       <w:r>
         <w:rPr>
@@ -1440,10 +1374,7 @@
         <w:t xml:space="preserve"> in the main text</w:t>
       </w:r>
       <w:r>
-        <w:t xml:space="preserve">). The dashed horizontal line indicates the ‘null’ weight in which all time periods would have equal weights. Any weights that extend clearly above this line suggest significant importance of the corresponding climate variable during that season to pinyon jay abundance. Seasons are based on pinyon jay biology: Br (breeding; February - </w:t>
-      </w:r>
-      <w:r>
-        <w:t>May), Fl (fledging; May - June), Su (summer localized foraging; July), and SW (summer and winter dispersed foraging or ‘irruption’ period; August - January).</w:t>
+        <w:t>). The dashed horizontal line indicates the ‘null’ weight in which all time periods would have equal weights. Any weights that extend clearly above this line suggest significant importance of the corresponding climate variable during that season to pinyon jay abundance. Seasons are based on pinyon jay biology: Br (breeding; February - May), Fl (fledging; May - June), Su (summer localized foraging; July), and SW (summer and winter dispersed foraging or ‘irruption’ period; August - January).</w:t>
       </w:r>
     </w:p>
     <w:p>
@@ -1484,7 +1415,7 @@
                     <pic:cNvPicPr/>
                   </pic:nvPicPr>
                   <pic:blipFill>
-                    <a:blip r:embed="rId9" cstate="print">
+                    <a:blip r:embed="rId6" cstate="print">
                       <a:extLst>
                         <a:ext uri="{28A0092B-C50C-407E-A947-70E740481C1C}">
                           <a14:useLocalDpi xmlns:a14="http://schemas.microsoft.com/office/drawing/2010/main" val="0"/>
@@ -1530,7 +1461,7 @@
                     <pic:cNvPicPr/>
                   </pic:nvPicPr>
                   <pic:blipFill>
-                    <a:blip r:embed="rId10" cstate="print">
+                    <a:blip r:embed="rId7" cstate="print">
                       <a:extLst>
                         <a:ext uri="{28A0092B-C50C-407E-A947-70E740481C1C}">
                           <a14:useLocalDpi xmlns:a14="http://schemas.microsoft.com/office/drawing/2010/main" val="0"/>
@@ -1576,7 +1507,7 @@
                     <pic:cNvPicPr/>
                   </pic:nvPicPr>
                   <pic:blipFill>
-                    <a:blip r:embed="rId11" cstate="print">
+                    <a:blip r:embed="rId8" cstate="print">
                       <a:extLst>
                         <a:ext uri="{28A0092B-C50C-407E-A947-70E740481C1C}">
                           <a14:useLocalDpi xmlns:a14="http://schemas.microsoft.com/office/drawing/2010/main" val="0"/>
@@ -1622,7 +1553,7 @@
                     <pic:cNvPicPr/>
                   </pic:nvPicPr>
                   <pic:blipFill>
-                    <a:blip r:embed="rId12" cstate="print">
+                    <a:blip r:embed="rId9" cstate="print">
                       <a:extLst>
                         <a:ext uri="{28A0092B-C50C-407E-A947-70E740481C1C}">
                           <a14:useLocalDpi xmlns:a14="http://schemas.microsoft.com/office/drawing/2010/main" val="0"/>
@@ -1668,7 +1599,7 @@
                     <pic:cNvPicPr/>
                   </pic:nvPicPr>
                   <pic:blipFill>
-                    <a:blip r:embed="rId13" cstate="print">
+                    <a:blip r:embed="rId10" cstate="print">
                       <a:extLst>
                         <a:ext uri="{28A0092B-C50C-407E-A947-70E740481C1C}">
                           <a14:useLocalDpi xmlns:a14="http://schemas.microsoft.com/office/drawing/2010/main" val="0"/>
@@ -1705,14 +1636,7 @@
           <w:b/>
           <w:bCs/>
         </w:rPr>
-        <w:t xml:space="preserve">SI Figure </w:t>
-      </w:r>
-      <w:r>
-        <w:rPr>
-          <w:b/>
-          <w:bCs/>
-        </w:rPr>
-        <w:t>2</w:t>
+        <w:t>Fig. S2</w:t>
       </w:r>
       <w:r>
         <w:rPr>
@@ -1764,7 +1688,7 @@
                     <pic:cNvPicPr/>
                   </pic:nvPicPr>
                   <pic:blipFill>
-                    <a:blip r:embed="rId14" cstate="print">
+                    <a:blip r:embed="rId11" cstate="print">
                       <a:extLst>
                         <a:ext uri="{28A0092B-C50C-407E-A947-70E740481C1C}">
                           <a14:useLocalDpi xmlns:a14="http://schemas.microsoft.com/office/drawing/2010/main" val="0"/>
@@ -1808,14 +1732,7 @@
           <w:b/>
           <w:bCs/>
         </w:rPr>
-        <w:t>SI Figure</w:t>
-      </w:r>
-      <w:r>
-        <w:rPr>
-          <w:b/>
-          <w:bCs/>
-        </w:rPr>
-        <w:t xml:space="preserve"> 3</w:t>
+        <w:t>Fig. S3</w:t>
       </w:r>
       <w:r>
         <w:rPr>
@@ -2022,10 +1939,10 @@
         </w:rPr>
         <w:lastRenderedPageBreak/>
         <w:drawing>
-          <wp:inline distT="0" distB="0" distL="0" distR="0" wp14:anchorId="745BB282" wp14:editId="78C53585">
+          <wp:inline distT="0" distB="0" distL="0" distR="0" wp14:anchorId="4AD9FC52" wp14:editId="7C9731FF">
             <wp:extent cx="5943600" cy="2971800"/>
             <wp:effectExtent l="0" t="0" r="0" b="0"/>
-            <wp:docPr id="1575714787" name="Picture 1" descr="A graph of a number of objects&#10;&#10;AI-generated content may be incorrect."/>
+            <wp:docPr id="317400787" name="Picture 1" descr="A graph of a graph showing a number of numbers&#10;&#10;AI-generated content may be incorrect."/>
             <wp:cNvGraphicFramePr>
               <a:graphicFrameLocks xmlns:a="http://schemas.openxmlformats.org/drawingml/2006/main" noChangeAspect="1"/>
             </wp:cNvGraphicFramePr>
@@ -2033,11 +1950,11 @@
               <a:graphicData uri="http://schemas.openxmlformats.org/drawingml/2006/picture">
                 <pic:pic xmlns:pic="http://schemas.openxmlformats.org/drawingml/2006/picture">
                   <pic:nvPicPr>
-                    <pic:cNvPr id="1575714787" name="Picture 1" descr="A graph of a number of objects&#10;&#10;AI-generated content may be incorrect."/>
+                    <pic:cNvPr id="317400787" name="Picture 1" descr="A graph of a graph showing a number of numbers&#10;&#10;AI-generated content may be incorrect."/>
                     <pic:cNvPicPr/>
                   </pic:nvPicPr>
                   <pic:blipFill>
-                    <a:blip r:embed="rId15" cstate="print">
+                    <a:blip r:embed="rId12" cstate="print">
                       <a:extLst>
                         <a:ext uri="{28A0092B-C50C-407E-A947-70E740481C1C}">
                           <a14:useLocalDpi xmlns:a14="http://schemas.microsoft.com/office/drawing/2010/main" val="0"/>
@@ -2068,38 +1985,15 @@
       <w:pPr>
         <w:pStyle w:val="ImageCaption"/>
       </w:pPr>
-      <w:commentRangeStart w:id="1"/>
-      <w:r>
-        <w:rPr>
-          <w:b/>
-          <w:bCs/>
-        </w:rPr>
-        <w:t>SI Figure</w:t>
-      </w:r>
-      <w:r>
-        <w:rPr>
-          <w:b/>
-          <w:bCs/>
-        </w:rPr>
-        <w:t xml:space="preserve"> 4</w:t>
-      </w:r>
-      <w:commentRangeEnd w:id="1"/>
-      <w:r>
-        <w:rPr>
-          <w:rStyle w:val="CommentReference"/>
-          <w:rFonts w:asciiTheme="minorHAnsi" w:hAnsiTheme="minorHAnsi"/>
-        </w:rPr>
-        <w:commentReference w:id="1"/>
-      </w:r>
-      <w:r>
-        <w:rPr>
-          <w:b/>
-          <w:bCs/>
-        </w:rPr>
-        <w:t>.</w:t>
-      </w:r>
-      <w:r>
-        <w:t xml:space="preserve"> As an evaluation of goodness-of-fit, we examined a) the relationship between observed pinyon jay counts and counts predicted from the model (median and 95% Bayesian Credible Interval) and b) the R</w:t>
+      <w:r>
+        <w:rPr>
+          <w:b/>
+          <w:bCs/>
+        </w:rPr>
+        <w:t xml:space="preserve">Fig. S4. </w:t>
+      </w:r>
+      <w:r>
+        <w:t>As an evaluation of goodness-of-fit, we examined a) the relationship between observed pinyon jay counts and counts predicted from the model (median and 95% Bayesian Credible Interval) and b) the R</w:t>
       </w:r>
       <w:r>
         <w:rPr>
@@ -2123,7 +2017,13 @@
         <w:t xml:space="preserve">best-fit line </w:t>
       </w:r>
       <w:r>
-        <w:t>between predicted and observed bird count values</w:t>
+        <w:t xml:space="preserve">between </w:t>
+      </w:r>
+      <w:r>
+        <w:t xml:space="preserve">log-log </w:t>
+      </w:r>
+      <w:r>
+        <w:t>predicted and observed bird count values</w:t>
       </w:r>
       <w:r>
         <w:t>. In b) the dashed vertical line represents the mean R</w:t>
@@ -2169,7 +2069,7 @@
                     <pic:cNvPicPr/>
                   </pic:nvPicPr>
                   <pic:blipFill>
-                    <a:blip r:embed="rId16">
+                    <a:blip r:embed="rId13">
                       <a:extLst>
                         <a:ext uri="{28A0092B-C50C-407E-A947-70E740481C1C}">
                           <a14:useLocalDpi xmlns:a14="http://schemas.microsoft.com/office/drawing/2010/main" val="0"/>
@@ -2205,24 +2105,10 @@
           <w:b/>
           <w:bCs/>
         </w:rPr>
-        <w:t>SI Figure</w:t>
-      </w:r>
-      <w:r>
-        <w:rPr>
-          <w:b/>
-          <w:bCs/>
-        </w:rPr>
-        <w:t xml:space="preserve"> 5</w:t>
-      </w:r>
-      <w:r>
-        <w:rPr>
-          <w:b/>
-          <w:bCs/>
-        </w:rPr>
-        <w:t>.</w:t>
-      </w:r>
-      <w:r>
-        <w:t xml:space="preserve"> Root mean squared error (RMSE) to evaluate the predictive ability of the model applied to the in-sample (“test”) and out-of-sample datasets. Values for RMSE are on the scale of the data (counts of pinyon jays per square kilometer). The RMSE values are relatively small compared to the range of possible counts in a checklist (0 to 350 birds per hectare in our test dataset).</w:t>
+        <w:t xml:space="preserve">Fig. S5. </w:t>
+      </w:r>
+      <w:r>
+        <w:t>Root mean squared error (RMSE) to evaluate the predictive ability of the model applied to the in-sample (“test”) and out-of-sample datasets. Values for RMSE are on the scale of the data (counts of pinyon jays per square kilometer). The RMSE values are relatively small compared to the range of possible counts in a checklist (0 to 350 birds per hectare in our test dataset).</w:t>
       </w:r>
     </w:p>
     <w:p>
@@ -2255,7 +2141,7 @@
                     </pic:cNvPicPr>
                   </pic:nvPicPr>
                   <pic:blipFill rotWithShape="1">
-                    <a:blip r:embed="rId17"/>
+                    <a:blip r:embed="rId14"/>
                     <a:srcRect r="35409" b="79274"/>
                     <a:stretch>
                       <a:fillRect/>
@@ -2305,7 +2191,7 @@
                     </pic:cNvPicPr>
                   </pic:nvPicPr>
                   <pic:blipFill rotWithShape="1">
-                    <a:blip r:embed="rId17"/>
+                    <a:blip r:embed="rId14"/>
                     <a:srcRect l="64568" r="2975" b="79485"/>
                     <a:stretch>
                       <a:fillRect/>
@@ -2355,7 +2241,7 @@
                     </pic:cNvPicPr>
                   </pic:nvPicPr>
                   <pic:blipFill rotWithShape="1">
-                    <a:blip r:embed="rId17"/>
+                    <a:blip r:embed="rId14"/>
                     <a:srcRect t="19872" r="67545" b="59398"/>
                     <a:stretch>
                       <a:fillRect/>
@@ -2411,7 +2297,7 @@
                     </pic:cNvPicPr>
                   </pic:nvPicPr>
                   <pic:blipFill rotWithShape="1">
-                    <a:blip r:embed="rId17"/>
+                    <a:blip r:embed="rId14"/>
                     <a:srcRect l="32116" t="20514" b="59934"/>
                     <a:stretch>
                       <a:fillRect/>
@@ -2461,7 +2347,7 @@
                     </pic:cNvPicPr>
                   </pic:nvPicPr>
                   <pic:blipFill rotWithShape="1">
-                    <a:blip r:embed="rId17"/>
+                    <a:blip r:embed="rId14"/>
                     <a:srcRect t="40384" r="35594" b="39419"/>
                     <a:stretch>
                       <a:fillRect/>
@@ -2512,7 +2398,7 @@
                     </pic:cNvPicPr>
                   </pic:nvPicPr>
                   <pic:blipFill rotWithShape="1">
-                    <a:blip r:embed="rId17"/>
+                    <a:blip r:embed="rId14"/>
                     <a:srcRect l="64904" t="40946" r="3281" b="39812"/>
                     <a:stretch>
                       <a:fillRect/>
@@ -2562,7 +2448,7 @@
                     </pic:cNvPicPr>
                   </pic:nvPicPr>
                   <pic:blipFill rotWithShape="1">
-                    <a:blip r:embed="rId17"/>
+                    <a:blip r:embed="rId14"/>
                     <a:srcRect t="59957" r="67380" b="19735"/>
                     <a:stretch>
                       <a:fillRect/>
@@ -2612,7 +2498,7 @@
                     </pic:cNvPicPr>
                   </pic:nvPicPr>
                   <pic:blipFill rotWithShape="1">
-                    <a:blip r:embed="rId17"/>
+                    <a:blip r:embed="rId14"/>
                     <a:srcRect l="32451" t="59740" r="1290" b="19426"/>
                     <a:stretch>
                       <a:fillRect/>
@@ -2668,7 +2554,7 @@
                     </pic:cNvPicPr>
                   </pic:nvPicPr>
                   <pic:blipFill rotWithShape="1">
-                    <a:blip r:embed="rId17"/>
+                    <a:blip r:embed="rId14"/>
                     <a:srcRect t="80047" r="64690"/>
                     <a:stretch>
                       <a:fillRect/>
@@ -2711,24 +2597,10 @@
           <w:b/>
           <w:bCs/>
         </w:rPr>
-        <w:t xml:space="preserve">SI Figure </w:t>
-      </w:r>
-      <w:r>
-        <w:rPr>
-          <w:b/>
-          <w:bCs/>
-        </w:rPr>
-        <w:t>6</w:t>
-      </w:r>
-      <w:r>
-        <w:rPr>
-          <w:b/>
-          <w:bCs/>
-        </w:rPr>
-        <w:t>.</w:t>
-      </w:r>
-      <w:r>
-        <w:t xml:space="preserve"> Evaluation of spatial autocorrelation (Pearson correlation on the y-axis) for residuals in each year (year indices are indicated above each figure panel, where 1 = 2010, 2 = 2011, …, 13 = 2022). </w:t>
+        <w:t xml:space="preserve">Fig. S6. </w:t>
+      </w:r>
+      <w:r>
+        <w:t xml:space="preserve">Evaluation of spatial autocorrelation (Pearson correlation on the y-axis) for residuals in each year (year indices are indicated above each figure panel, where 1 = 2010, 2 = 2011, …, 13 = 2022). </w:t>
       </w:r>
       <w:r>
         <w:t xml:space="preserve">Distance values are in kilometers. </w:t>
@@ -2755,6 +2627,760 @@
       <w:pPr>
         <w:pStyle w:val="ImageCaption"/>
       </w:pPr>
+    </w:p>
+    <w:p>
+      <w:pPr>
+        <w:pStyle w:val="ImageCaption"/>
+        <w:rPr>
+          <w:b/>
+          <w:bCs/>
+        </w:rPr>
+      </w:pPr>
+      <w:r>
+        <w:rPr>
+          <w:b/>
+          <w:bCs/>
+        </w:rPr>
+        <w:t>References</w:t>
+      </w:r>
+    </w:p>
+    <w:p>
+      <w:pPr>
+        <w:pStyle w:val="Bibliography"/>
+        <w:rPr>
+          <w:rFonts w:ascii="Times New Roman" w:hAnsi="Times New Roman" w:cs="Times New Roman"/>
+        </w:rPr>
+      </w:pPr>
+      <w:r>
+        <w:rPr>
+          <w:b/>
+          <w:bCs/>
+        </w:rPr>
+        <w:fldChar w:fldCharType="begin"/>
+      </w:r>
+      <w:r>
+        <w:rPr>
+          <w:b/>
+          <w:bCs/>
+        </w:rPr>
+        <w:instrText xml:space="preserve"> ADDIN ZOTERO_BIBL {"uncited":[],"omitted":[],"custom":[]} CSL_BIBLIOGRAPHY </w:instrText>
+      </w:r>
+      <w:r>
+        <w:rPr>
+          <w:b/>
+          <w:bCs/>
+        </w:rPr>
+        <w:fldChar w:fldCharType="separate"/>
+      </w:r>
+      <w:r>
+        <w:rPr>
+          <w:rFonts w:ascii="Times New Roman" w:hAnsi="Times New Roman" w:cs="Times New Roman"/>
+        </w:rPr>
+        <w:t xml:space="preserve">1. </w:t>
+      </w:r>
+      <w:r>
+        <w:rPr>
+          <w:rFonts w:ascii="Times New Roman" w:hAnsi="Times New Roman" w:cs="Times New Roman"/>
+        </w:rPr>
+        <w:tab/>
+        <w:t xml:space="preserve">M. Plummer, JAGS: A program for analysis of Bayesian graphical models using Gibbs sampling. </w:t>
+      </w:r>
+      <w:r>
+        <w:rPr>
+          <w:rFonts w:ascii="Times New Roman" w:hAnsi="Times New Roman" w:cs="Times New Roman"/>
+          <w:i/>
+          <w:iCs/>
+        </w:rPr>
+        <w:t>Proceedings of the 3rd international workshop on distributed statistical computing</w:t>
+      </w:r>
+      <w:r>
+        <w:rPr>
+          <w:rFonts w:ascii="Times New Roman" w:hAnsi="Times New Roman" w:cs="Times New Roman"/>
+        </w:rPr>
+        <w:t xml:space="preserve"> </w:t>
+      </w:r>
+      <w:r>
+        <w:rPr>
+          <w:rFonts w:ascii="Times New Roman" w:hAnsi="Times New Roman" w:cs="Times New Roman"/>
+          <w:b/>
+          <w:bCs/>
+        </w:rPr>
+        <w:t>124</w:t>
+      </w:r>
+      <w:r>
+        <w:rPr>
+          <w:rFonts w:ascii="Times New Roman" w:hAnsi="Times New Roman" w:cs="Times New Roman"/>
+        </w:rPr>
+        <w:t xml:space="preserve"> (2003).</w:t>
+      </w:r>
+    </w:p>
+    <w:p>
+      <w:pPr>
+        <w:pStyle w:val="Bibliography"/>
+        <w:rPr>
+          <w:rFonts w:ascii="Times New Roman" w:hAnsi="Times New Roman" w:cs="Times New Roman"/>
+        </w:rPr>
+      </w:pPr>
+      <w:r>
+        <w:rPr>
+          <w:rFonts w:ascii="Times New Roman" w:hAnsi="Times New Roman" w:cs="Times New Roman"/>
+        </w:rPr>
+        <w:t xml:space="preserve">2. </w:t>
+      </w:r>
+      <w:r>
+        <w:rPr>
+          <w:rFonts w:ascii="Times New Roman" w:hAnsi="Times New Roman" w:cs="Times New Roman"/>
+        </w:rPr>
+        <w:tab/>
+        <w:t>R Core Team, R: A language and environment for statistical computing. (2020). Deposited 2020.</w:t>
+      </w:r>
+    </w:p>
+    <w:p>
+      <w:pPr>
+        <w:pStyle w:val="Bibliography"/>
+        <w:rPr>
+          <w:rFonts w:ascii="Times New Roman" w:hAnsi="Times New Roman" w:cs="Times New Roman"/>
+        </w:rPr>
+      </w:pPr>
+      <w:r>
+        <w:rPr>
+          <w:rFonts w:ascii="Times New Roman" w:hAnsi="Times New Roman" w:cs="Times New Roman"/>
+        </w:rPr>
+        <w:t xml:space="preserve">3. </w:t>
+      </w:r>
+      <w:r>
+        <w:rPr>
+          <w:rFonts w:ascii="Times New Roman" w:hAnsi="Times New Roman" w:cs="Times New Roman"/>
+        </w:rPr>
+        <w:tab/>
+        <w:t>K. Kellner, jagsUI: a wrapper around “rjags” to streamline JAGS analyses. (2021). Deposited 2021.</w:t>
+      </w:r>
+    </w:p>
+    <w:p>
+      <w:pPr>
+        <w:pStyle w:val="Bibliography"/>
+        <w:rPr>
+          <w:rFonts w:ascii="Times New Roman" w:hAnsi="Times New Roman" w:cs="Times New Roman"/>
+        </w:rPr>
+      </w:pPr>
+      <w:r>
+        <w:rPr>
+          <w:rFonts w:ascii="Times New Roman" w:hAnsi="Times New Roman" w:cs="Times New Roman"/>
+        </w:rPr>
+        <w:t xml:space="preserve">4. </w:t>
+      </w:r>
+      <w:r>
+        <w:rPr>
+          <w:rFonts w:ascii="Times New Roman" w:hAnsi="Times New Roman" w:cs="Times New Roman"/>
+        </w:rPr>
+        <w:tab/>
+        <w:t xml:space="preserve">A. E. Raftery, S. M. Lewis, “The number of iterations, convergence diagnostics and generic Netropolis algorithms” in </w:t>
+      </w:r>
+      <w:r>
+        <w:rPr>
+          <w:rFonts w:ascii="Times New Roman" w:hAnsi="Times New Roman" w:cs="Times New Roman"/>
+          <w:i/>
+          <w:iCs/>
+        </w:rPr>
+        <w:t>Practical Markov Chain Monte Carlo</w:t>
+      </w:r>
+      <w:r>
+        <w:rPr>
+          <w:rFonts w:ascii="Times New Roman" w:hAnsi="Times New Roman" w:cs="Times New Roman"/>
+        </w:rPr>
+        <w:t>, (Chapman and Hall, 1995).</w:t>
+      </w:r>
+    </w:p>
+    <w:p>
+      <w:pPr>
+        <w:pStyle w:val="Bibliography"/>
+        <w:rPr>
+          <w:rFonts w:ascii="Times New Roman" w:hAnsi="Times New Roman" w:cs="Times New Roman"/>
+        </w:rPr>
+      </w:pPr>
+      <w:r>
+        <w:rPr>
+          <w:rFonts w:ascii="Times New Roman" w:hAnsi="Times New Roman" w:cs="Times New Roman"/>
+        </w:rPr>
+        <w:t xml:space="preserve">5. </w:t>
+      </w:r>
+      <w:r>
+        <w:rPr>
+          <w:rFonts w:ascii="Times New Roman" w:hAnsi="Times New Roman" w:cs="Times New Roman"/>
+        </w:rPr>
+        <w:tab/>
+        <w:t>S. M. Curtis, mcmcplots: Create Plots from MCMC Output. https://doi.org/10.32614/CRAN.package.mcmcplots. Deposited 6 July 2010.</w:t>
+      </w:r>
+    </w:p>
+    <w:p>
+      <w:pPr>
+        <w:pStyle w:val="Bibliography"/>
+        <w:rPr>
+          <w:rFonts w:ascii="Times New Roman" w:hAnsi="Times New Roman" w:cs="Times New Roman"/>
+        </w:rPr>
+      </w:pPr>
+      <w:r>
+        <w:rPr>
+          <w:rFonts w:ascii="Times New Roman" w:hAnsi="Times New Roman" w:cs="Times New Roman"/>
+        </w:rPr>
+        <w:t xml:space="preserve">6. </w:t>
+      </w:r>
+      <w:r>
+        <w:rPr>
+          <w:rFonts w:ascii="Times New Roman" w:hAnsi="Times New Roman" w:cs="Times New Roman"/>
+        </w:rPr>
+        <w:tab/>
+        <w:t xml:space="preserve">M. Plummer, </w:t>
+      </w:r>
+      <w:r>
+        <w:rPr>
+          <w:rFonts w:ascii="Times New Roman" w:hAnsi="Times New Roman" w:cs="Times New Roman"/>
+          <w:i/>
+          <w:iCs/>
+        </w:rPr>
+        <w:t>et al.</w:t>
+      </w:r>
+      <w:r>
+        <w:rPr>
+          <w:rFonts w:ascii="Times New Roman" w:hAnsi="Times New Roman" w:cs="Times New Roman"/>
+        </w:rPr>
+        <w:t>, coda: Output Analysis and Diagnostics for MCMC. https://doi.org/10.32614/CRAN.package.coda. Deposited 4 June 1999.</w:t>
+      </w:r>
+    </w:p>
+    <w:p>
+      <w:pPr>
+        <w:pStyle w:val="Bibliography"/>
+        <w:rPr>
+          <w:rFonts w:ascii="Times New Roman" w:hAnsi="Times New Roman" w:cs="Times New Roman"/>
+        </w:rPr>
+      </w:pPr>
+      <w:r>
+        <w:rPr>
+          <w:rFonts w:ascii="Times New Roman" w:hAnsi="Times New Roman" w:cs="Times New Roman"/>
+        </w:rPr>
+        <w:lastRenderedPageBreak/>
+        <w:t xml:space="preserve">7. </w:t>
+      </w:r>
+      <w:r>
+        <w:rPr>
+          <w:rFonts w:ascii="Times New Roman" w:hAnsi="Times New Roman" w:cs="Times New Roman"/>
+        </w:rPr>
+        <w:tab/>
+        <w:t xml:space="preserve">A. Gelman, D. B. Rubin, Inference from Iterative Simulation Using Multiple Sequences. </w:t>
+      </w:r>
+      <w:r>
+        <w:rPr>
+          <w:rFonts w:ascii="Times New Roman" w:hAnsi="Times New Roman" w:cs="Times New Roman"/>
+          <w:i/>
+          <w:iCs/>
+        </w:rPr>
+        <w:t>Statist. Sci.</w:t>
+      </w:r>
+      <w:r>
+        <w:rPr>
+          <w:rFonts w:ascii="Times New Roman" w:hAnsi="Times New Roman" w:cs="Times New Roman"/>
+        </w:rPr>
+        <w:t xml:space="preserve"> </w:t>
+      </w:r>
+      <w:r>
+        <w:rPr>
+          <w:rFonts w:ascii="Times New Roman" w:hAnsi="Times New Roman" w:cs="Times New Roman"/>
+          <w:b/>
+          <w:bCs/>
+        </w:rPr>
+        <w:t>7</w:t>
+      </w:r>
+      <w:r>
+        <w:rPr>
+          <w:rFonts w:ascii="Times New Roman" w:hAnsi="Times New Roman" w:cs="Times New Roman"/>
+        </w:rPr>
+        <w:t xml:space="preserve"> (1992).</w:t>
+      </w:r>
+    </w:p>
+    <w:p>
+      <w:pPr>
+        <w:pStyle w:val="Bibliography"/>
+        <w:rPr>
+          <w:rFonts w:ascii="Times New Roman" w:hAnsi="Times New Roman" w:cs="Times New Roman"/>
+        </w:rPr>
+      </w:pPr>
+      <w:r>
+        <w:rPr>
+          <w:rFonts w:ascii="Times New Roman" w:hAnsi="Times New Roman" w:cs="Times New Roman"/>
+        </w:rPr>
+        <w:t xml:space="preserve">8. </w:t>
+      </w:r>
+      <w:r>
+        <w:rPr>
+          <w:rFonts w:ascii="Times New Roman" w:hAnsi="Times New Roman" w:cs="Times New Roman"/>
+        </w:rPr>
+        <w:tab/>
+        <w:t>O. N. Bjornstad, ncf: Spatial Covariance Functions. The R Foundation. https://doi.org/10.32614/cran.package.ncf. Deposited 14 April 2008.</w:t>
+      </w:r>
+    </w:p>
+    <w:p>
+      <w:pPr>
+        <w:pStyle w:val="Bibliography"/>
+        <w:rPr>
+          <w:rFonts w:ascii="Times New Roman" w:hAnsi="Times New Roman" w:cs="Times New Roman"/>
+        </w:rPr>
+      </w:pPr>
+      <w:r>
+        <w:rPr>
+          <w:rFonts w:ascii="Times New Roman" w:hAnsi="Times New Roman" w:cs="Times New Roman"/>
+        </w:rPr>
+        <w:t xml:space="preserve">9. </w:t>
+      </w:r>
+      <w:r>
+        <w:rPr>
+          <w:rFonts w:ascii="Times New Roman" w:hAnsi="Times New Roman" w:cs="Times New Roman"/>
+        </w:rPr>
+        <w:tab/>
+        <w:t xml:space="preserve">L. Breiman, Random Forests. </w:t>
+      </w:r>
+      <w:r>
+        <w:rPr>
+          <w:rFonts w:ascii="Times New Roman" w:hAnsi="Times New Roman" w:cs="Times New Roman"/>
+          <w:i/>
+          <w:iCs/>
+        </w:rPr>
+        <w:t>Machine Learning</w:t>
+      </w:r>
+      <w:r>
+        <w:rPr>
+          <w:rFonts w:ascii="Times New Roman" w:hAnsi="Times New Roman" w:cs="Times New Roman"/>
+        </w:rPr>
+        <w:t xml:space="preserve"> </w:t>
+      </w:r>
+      <w:r>
+        <w:rPr>
+          <w:rFonts w:ascii="Times New Roman" w:hAnsi="Times New Roman" w:cs="Times New Roman"/>
+          <w:b/>
+          <w:bCs/>
+        </w:rPr>
+        <w:t>45</w:t>
+      </w:r>
+      <w:r>
+        <w:rPr>
+          <w:rFonts w:ascii="Times New Roman" w:hAnsi="Times New Roman" w:cs="Times New Roman"/>
+        </w:rPr>
+        <w:t>, 5–32 (2001).</w:t>
+      </w:r>
+    </w:p>
+    <w:p>
+      <w:pPr>
+        <w:pStyle w:val="Bibliography"/>
+        <w:rPr>
+          <w:rFonts w:ascii="Times New Roman" w:hAnsi="Times New Roman" w:cs="Times New Roman"/>
+        </w:rPr>
+      </w:pPr>
+      <w:r>
+        <w:rPr>
+          <w:rFonts w:ascii="Times New Roman" w:hAnsi="Times New Roman" w:cs="Times New Roman"/>
+        </w:rPr>
+        <w:t xml:space="preserve">10. </w:t>
+      </w:r>
+      <w:r>
+        <w:rPr>
+          <w:rFonts w:ascii="Times New Roman" w:hAnsi="Times New Roman" w:cs="Times New Roman"/>
+        </w:rPr>
+        <w:tab/>
+        <w:t>K. Muller, here: A simpler way to find your files. (2020). Deposited 2020.</w:t>
+      </w:r>
+    </w:p>
+    <w:p>
+      <w:pPr>
+        <w:pStyle w:val="Bibliography"/>
+        <w:rPr>
+          <w:rFonts w:ascii="Times New Roman" w:hAnsi="Times New Roman" w:cs="Times New Roman"/>
+        </w:rPr>
+      </w:pPr>
+      <w:r>
+        <w:rPr>
+          <w:rFonts w:ascii="Times New Roman" w:hAnsi="Times New Roman" w:cs="Times New Roman"/>
+        </w:rPr>
+        <w:t xml:space="preserve">11. </w:t>
+      </w:r>
+      <w:r>
+        <w:rPr>
+          <w:rFonts w:ascii="Times New Roman" w:hAnsi="Times New Roman" w:cs="Times New Roman"/>
+        </w:rPr>
+        <w:tab/>
+        <w:t xml:space="preserve">H. Wickham, </w:t>
+      </w:r>
+      <w:r>
+        <w:rPr>
+          <w:rFonts w:ascii="Times New Roman" w:hAnsi="Times New Roman" w:cs="Times New Roman"/>
+          <w:i/>
+          <w:iCs/>
+        </w:rPr>
+        <w:t>et al.</w:t>
+      </w:r>
+      <w:r>
+        <w:rPr>
+          <w:rFonts w:ascii="Times New Roman" w:hAnsi="Times New Roman" w:cs="Times New Roman"/>
+        </w:rPr>
+        <w:t xml:space="preserve">, Welcome to the Tidyverse. </w:t>
+      </w:r>
+      <w:r>
+        <w:rPr>
+          <w:rFonts w:ascii="Times New Roman" w:hAnsi="Times New Roman" w:cs="Times New Roman"/>
+          <w:i/>
+          <w:iCs/>
+        </w:rPr>
+        <w:t>JOSS</w:t>
+      </w:r>
+      <w:r>
+        <w:rPr>
+          <w:rFonts w:ascii="Times New Roman" w:hAnsi="Times New Roman" w:cs="Times New Roman"/>
+        </w:rPr>
+        <w:t xml:space="preserve"> </w:t>
+      </w:r>
+      <w:r>
+        <w:rPr>
+          <w:rFonts w:ascii="Times New Roman" w:hAnsi="Times New Roman" w:cs="Times New Roman"/>
+          <w:b/>
+          <w:bCs/>
+        </w:rPr>
+        <w:t>4</w:t>
+      </w:r>
+      <w:r>
+        <w:rPr>
+          <w:rFonts w:ascii="Times New Roman" w:hAnsi="Times New Roman" w:cs="Times New Roman"/>
+        </w:rPr>
+        <w:t>, 1686 (2019).</w:t>
+      </w:r>
+    </w:p>
+    <w:p>
+      <w:pPr>
+        <w:pStyle w:val="Bibliography"/>
+        <w:rPr>
+          <w:rFonts w:ascii="Times New Roman" w:hAnsi="Times New Roman" w:cs="Times New Roman"/>
+        </w:rPr>
+      </w:pPr>
+      <w:r>
+        <w:rPr>
+          <w:rFonts w:ascii="Times New Roman" w:hAnsi="Times New Roman" w:cs="Times New Roman"/>
+        </w:rPr>
+        <w:t xml:space="preserve">12. </w:t>
+      </w:r>
+      <w:r>
+        <w:rPr>
+          <w:rFonts w:ascii="Times New Roman" w:hAnsi="Times New Roman" w:cs="Times New Roman"/>
+        </w:rPr>
+        <w:tab/>
+        <w:t xml:space="preserve">E. Pebesma, R. Bivand, </w:t>
+      </w:r>
+      <w:r>
+        <w:rPr>
+          <w:rFonts w:ascii="Times New Roman" w:hAnsi="Times New Roman" w:cs="Times New Roman"/>
+          <w:i/>
+          <w:iCs/>
+        </w:rPr>
+        <w:t>Spatial Data Science: With Applications in R</w:t>
+      </w:r>
+      <w:r>
+        <w:rPr>
+          <w:rFonts w:ascii="Times New Roman" w:hAnsi="Times New Roman" w:cs="Times New Roman"/>
+        </w:rPr>
+        <w:t>, 1st Ed. (Chapman and Hall/CRC, 2023).</w:t>
+      </w:r>
+    </w:p>
+    <w:p>
+      <w:pPr>
+        <w:pStyle w:val="Bibliography"/>
+        <w:rPr>
+          <w:rFonts w:ascii="Times New Roman" w:hAnsi="Times New Roman" w:cs="Times New Roman"/>
+        </w:rPr>
+      </w:pPr>
+      <w:r>
+        <w:rPr>
+          <w:rFonts w:ascii="Times New Roman" w:hAnsi="Times New Roman" w:cs="Times New Roman"/>
+        </w:rPr>
+        <w:t xml:space="preserve">13. </w:t>
+      </w:r>
+      <w:r>
+        <w:rPr>
+          <w:rFonts w:ascii="Times New Roman" w:hAnsi="Times New Roman" w:cs="Times New Roman"/>
+        </w:rPr>
+        <w:tab/>
+        <w:t>R. J. Hijmans, terra: Spatial Data Analysis. The R Foundation. https://doi.org/10.32614/cran.package.terra. Deposited 20 March 2020.</w:t>
+      </w:r>
+    </w:p>
+    <w:p>
+      <w:pPr>
+        <w:pStyle w:val="Bibliography"/>
+        <w:rPr>
+          <w:rFonts w:ascii="Times New Roman" w:hAnsi="Times New Roman" w:cs="Times New Roman"/>
+        </w:rPr>
+      </w:pPr>
+      <w:r>
+        <w:rPr>
+          <w:rFonts w:ascii="Times New Roman" w:hAnsi="Times New Roman" w:cs="Times New Roman"/>
+        </w:rPr>
+        <w:t xml:space="preserve">14. </w:t>
+      </w:r>
+      <w:r>
+        <w:rPr>
+          <w:rFonts w:ascii="Times New Roman" w:hAnsi="Times New Roman" w:cs="Times New Roman"/>
+        </w:rPr>
+        <w:tab/>
+        <w:t>H. Wickham, J. Bryan, readxl: Read Excel Files. https://doi.org/10.32614/CRAN.package.readxl. Deposited 14 April 2015.</w:t>
+      </w:r>
+    </w:p>
+    <w:p>
+      <w:pPr>
+        <w:pStyle w:val="Bibliography"/>
+        <w:rPr>
+          <w:rFonts w:ascii="Times New Roman" w:hAnsi="Times New Roman" w:cs="Times New Roman"/>
+        </w:rPr>
+      </w:pPr>
+      <w:r>
+        <w:rPr>
+          <w:rFonts w:ascii="Times New Roman" w:hAnsi="Times New Roman" w:cs="Times New Roman"/>
+        </w:rPr>
+        <w:t xml:space="preserve">15. </w:t>
+      </w:r>
+      <w:r>
+        <w:rPr>
+          <w:rFonts w:ascii="Times New Roman" w:hAnsi="Times New Roman" w:cs="Times New Roman"/>
+        </w:rPr>
+        <w:tab/>
+        <w:t>Daniel Baston, exactextractr: Fast Extraction from Raster Datasets using Polygons. The R Foundation. https://doi.org/10.32614/cran.package.exactextractr. Deposited 1 August 2019.</w:t>
+      </w:r>
+    </w:p>
+    <w:p>
+      <w:pPr>
+        <w:pStyle w:val="Bibliography"/>
+        <w:rPr>
+          <w:rFonts w:ascii="Times New Roman" w:hAnsi="Times New Roman" w:cs="Times New Roman"/>
+        </w:rPr>
+      </w:pPr>
+      <w:r>
+        <w:rPr>
+          <w:rFonts w:ascii="Times New Roman" w:hAnsi="Times New Roman" w:cs="Times New Roman"/>
+        </w:rPr>
+        <w:t xml:space="preserve">16. </w:t>
+      </w:r>
+      <w:r>
+        <w:rPr>
+          <w:rFonts w:ascii="Times New Roman" w:hAnsi="Times New Roman" w:cs="Times New Roman"/>
+        </w:rPr>
+        <w:tab/>
+        <w:t>J. S. Evans, M. A. Murphy, spatialEco. (2023). Deposited 2023.</w:t>
+      </w:r>
+    </w:p>
+    <w:p>
+      <w:pPr>
+        <w:pStyle w:val="Bibliography"/>
+        <w:rPr>
+          <w:rFonts w:ascii="Times New Roman" w:hAnsi="Times New Roman" w:cs="Times New Roman"/>
+        </w:rPr>
+      </w:pPr>
+      <w:r>
+        <w:rPr>
+          <w:rFonts w:ascii="Times New Roman" w:hAnsi="Times New Roman" w:cs="Times New Roman"/>
+        </w:rPr>
+        <w:t xml:space="preserve">17. </w:t>
+      </w:r>
+      <w:r>
+        <w:rPr>
+          <w:rFonts w:ascii="Times New Roman" w:hAnsi="Times New Roman" w:cs="Times New Roman"/>
+        </w:rPr>
+        <w:tab/>
+        <w:t>M. Dorman, nngeo: k-Nearest Neighbor Join for Spatial Data. The R Foundation. https://doi.org/10.32614/cran.package.nngeo. Deposited 16 January 2018.</w:t>
+      </w:r>
+    </w:p>
+    <w:p>
+      <w:pPr>
+        <w:pStyle w:val="Bibliography"/>
+        <w:rPr>
+          <w:rFonts w:ascii="Times New Roman" w:hAnsi="Times New Roman" w:cs="Times New Roman"/>
+        </w:rPr>
+      </w:pPr>
+      <w:r>
+        <w:rPr>
+          <w:rFonts w:ascii="Times New Roman" w:hAnsi="Times New Roman" w:cs="Times New Roman"/>
+        </w:rPr>
+        <w:t xml:space="preserve">18. </w:t>
+      </w:r>
+      <w:r>
+        <w:rPr>
+          <w:rFonts w:ascii="Times New Roman" w:hAnsi="Times New Roman" w:cs="Times New Roman"/>
+        </w:rPr>
+        <w:tab/>
+        <w:t>M. Strimas-Mackey, E. Miller, W. Hochachka, auk: eBird Data Extraction and Processing in R. The R Foundation. https://doi.org/10.32614/cran.package.auk. Deposited 5 July 2017.</w:t>
+      </w:r>
+    </w:p>
+    <w:p>
+      <w:pPr>
+        <w:pStyle w:val="Bibliography"/>
+        <w:rPr>
+          <w:rFonts w:ascii="Times New Roman" w:hAnsi="Times New Roman" w:cs="Times New Roman"/>
+        </w:rPr>
+      </w:pPr>
+      <w:r>
+        <w:rPr>
+          <w:rFonts w:ascii="Times New Roman" w:hAnsi="Times New Roman" w:cs="Times New Roman"/>
+        </w:rPr>
+        <w:t xml:space="preserve">19. </w:t>
+      </w:r>
+      <w:r>
+        <w:rPr>
+          <w:rFonts w:ascii="Times New Roman" w:hAnsi="Times New Roman" w:cs="Times New Roman"/>
+        </w:rPr>
+        <w:tab/>
+        <w:t>G. Grolemund, H. Wickham, Dates and Times Made Easy with</w:t>
+      </w:r>
+      <w:r>
+        <w:rPr>
+          <w:rFonts w:ascii="Times New Roman" w:hAnsi="Times New Roman" w:cs="Times New Roman"/>
+          <w:b/>
+          <w:bCs/>
+        </w:rPr>
+        <w:t>lubridate</w:t>
+      </w:r>
+      <w:r>
+        <w:rPr>
+          <w:rFonts w:ascii="Times New Roman" w:hAnsi="Times New Roman" w:cs="Times New Roman"/>
+        </w:rPr>
+        <w:t xml:space="preserve">. </w:t>
+      </w:r>
+      <w:r>
+        <w:rPr>
+          <w:rFonts w:ascii="Times New Roman" w:hAnsi="Times New Roman" w:cs="Times New Roman"/>
+          <w:i/>
+          <w:iCs/>
+        </w:rPr>
+        <w:t>J. Stat. Soft.</w:t>
+      </w:r>
+      <w:r>
+        <w:rPr>
+          <w:rFonts w:ascii="Times New Roman" w:hAnsi="Times New Roman" w:cs="Times New Roman"/>
+        </w:rPr>
+        <w:t xml:space="preserve"> </w:t>
+      </w:r>
+      <w:r>
+        <w:rPr>
+          <w:rFonts w:ascii="Times New Roman" w:hAnsi="Times New Roman" w:cs="Times New Roman"/>
+          <w:b/>
+          <w:bCs/>
+        </w:rPr>
+        <w:t>40</w:t>
+      </w:r>
+      <w:r>
+        <w:rPr>
+          <w:rFonts w:ascii="Times New Roman" w:hAnsi="Times New Roman" w:cs="Times New Roman"/>
+        </w:rPr>
+        <w:t xml:space="preserve"> (2011).</w:t>
+      </w:r>
+    </w:p>
+    <w:p>
+      <w:pPr>
+        <w:pStyle w:val="Bibliography"/>
+        <w:rPr>
+          <w:rFonts w:ascii="Times New Roman" w:hAnsi="Times New Roman" w:cs="Times New Roman"/>
+        </w:rPr>
+      </w:pPr>
+      <w:r>
+        <w:rPr>
+          <w:rFonts w:ascii="Times New Roman" w:hAnsi="Times New Roman" w:cs="Times New Roman"/>
+        </w:rPr>
+        <w:t xml:space="preserve">20. </w:t>
+      </w:r>
+      <w:r>
+        <w:rPr>
+          <w:rFonts w:ascii="Times New Roman" w:hAnsi="Times New Roman" w:cs="Times New Roman"/>
+        </w:rPr>
+        <w:tab/>
+        <w:t>E. Hart, K. Bell, prism: Access data from the Oregon State Prism climate project. (2015). https://doi.org/10.5281/ZENODO.33663. Deposited 12 November 2015.</w:t>
+      </w:r>
+    </w:p>
+    <w:p>
+      <w:pPr>
+        <w:pStyle w:val="Bibliography"/>
+        <w:rPr>
+          <w:rFonts w:ascii="Times New Roman" w:hAnsi="Times New Roman" w:cs="Times New Roman"/>
+        </w:rPr>
+      </w:pPr>
+      <w:r>
+        <w:rPr>
+          <w:rFonts w:ascii="Times New Roman" w:hAnsi="Times New Roman" w:cs="Times New Roman"/>
+        </w:rPr>
+        <w:t xml:space="preserve">21. </w:t>
+      </w:r>
+      <w:r>
+        <w:rPr>
+          <w:rFonts w:ascii="Times New Roman" w:hAnsi="Times New Roman" w:cs="Times New Roman"/>
+        </w:rPr>
+        <w:tab/>
+        <w:t xml:space="preserve">A. Beygelzimer, </w:t>
+      </w:r>
+      <w:r>
+        <w:rPr>
+          <w:rFonts w:ascii="Times New Roman" w:hAnsi="Times New Roman" w:cs="Times New Roman"/>
+          <w:i/>
+          <w:iCs/>
+        </w:rPr>
+        <w:t>et al.</w:t>
+      </w:r>
+      <w:r>
+        <w:rPr>
+          <w:rFonts w:ascii="Times New Roman" w:hAnsi="Times New Roman" w:cs="Times New Roman"/>
+        </w:rPr>
+        <w:t>, FNN: Fast Nearest Neighbor Search Algorithms and Applications. The R Foundation. https://doi.org/10.32614/cran.package.fnn. Deposited 17 March 2010.</w:t>
+      </w:r>
+    </w:p>
+    <w:p>
+      <w:pPr>
+        <w:pStyle w:val="Bibliography"/>
+        <w:rPr>
+          <w:rFonts w:ascii="Times New Roman" w:hAnsi="Times New Roman" w:cs="Times New Roman"/>
+        </w:rPr>
+      </w:pPr>
+      <w:r>
+        <w:rPr>
+          <w:rFonts w:ascii="Times New Roman" w:hAnsi="Times New Roman" w:cs="Times New Roman"/>
+        </w:rPr>
+        <w:t xml:space="preserve">22. </w:t>
+      </w:r>
+      <w:r>
+        <w:rPr>
+          <w:rFonts w:ascii="Times New Roman" w:hAnsi="Times New Roman" w:cs="Times New Roman"/>
+        </w:rPr>
+        <w:tab/>
+        <w:t xml:space="preserve">T. Barrett, </w:t>
+      </w:r>
+      <w:r>
+        <w:rPr>
+          <w:rFonts w:ascii="Times New Roman" w:hAnsi="Times New Roman" w:cs="Times New Roman"/>
+          <w:i/>
+          <w:iCs/>
+        </w:rPr>
+        <w:t>et al.</w:t>
+      </w:r>
+      <w:r>
+        <w:rPr>
+          <w:rFonts w:ascii="Times New Roman" w:hAnsi="Times New Roman" w:cs="Times New Roman"/>
+        </w:rPr>
+        <w:t>, data.table: Extension of `data.frame`. The R Foundation. https://doi.org/10.32614/cran.package.data.table. Deposited 15 April 2006.</w:t>
+      </w:r>
+    </w:p>
+    <w:p>
+      <w:pPr>
+        <w:pStyle w:val="ImageCaption"/>
+        <w:rPr>
+          <w:b/>
+          <w:bCs/>
+        </w:rPr>
+      </w:pPr>
+      <w:r>
+        <w:rPr>
+          <w:b/>
+          <w:bCs/>
+        </w:rPr>
+        <w:fldChar w:fldCharType="end"/>
+      </w:r>
     </w:p>
     <w:p>
       <w:pPr>
@@ -2785,74 +3411,6 @@
     </w:sectPr>
   </w:body>
 </w:document>
-</file>
-
-<file path=word/comments.xml><?xml version="1.0" encoding="utf-8"?>
-<w:comments xmlns:wpc="http://schemas.microsoft.com/office/word/2010/wordprocessingCanvas" xmlns:cx="http://schemas.microsoft.com/office/drawing/2014/chartex" xmlns:cx1="http://schemas.microsoft.com/office/drawing/2015/9/8/chartex" xmlns:cx2="http://schemas.microsoft.com/office/drawing/2015/10/21/chartex" xmlns:cx3="http://schemas.microsoft.com/office/drawing/2016/5/9/chartex" xmlns:cx4="http://schemas.microsoft.com/office/drawing/2016/5/10/chartex" xmlns:cx5="http://schemas.microsoft.com/office/drawing/2016/5/11/chartex" xmlns:cx6="http://schemas.microsoft.com/office/drawing/2016/5/12/chartex" xmlns:cx7="http://schemas.microsoft.com/office/drawing/2016/5/13/chartex" xmlns:cx8="http://schemas.microsoft.com/office/drawing/2016/5/14/chartex" xmlns:mc="http://schemas.openxmlformats.org/markup-compatibility/2006" xmlns:aink="http://schemas.microsoft.com/office/drawing/2016/ink" xmlns:am3d="http://schemas.microsoft.com/office/drawing/2017/model3d" xmlns:o="urn:schemas-microsoft-com:office:office" xmlns:oel="http://schemas.microsoft.com/office/2019/extlst" xmlns:r="http://schemas.openxmlformats.org/officeDocument/2006/relationships" xmlns:m="http://schemas.openxmlformats.org/officeDocument/2006/math" xmlns:v="urn:schemas-microsoft-com:vml" xmlns:wp14="http://schemas.microsoft.com/office/word/2010/wordprocessingDrawing" xmlns:wp="http://schemas.openxmlformats.org/drawingml/2006/wordprocessingDrawing" xmlns:w10="urn:schemas-microsoft-com:office:word" xmlns:w="http://schemas.openxmlformats.org/wordprocessingml/2006/main" xmlns:w14="http://schemas.microsoft.com/office/word/2010/wordml" xmlns:w15="http://schemas.microsoft.com/office/word/2012/wordml" xmlns:w16cex="http://schemas.microsoft.com/office/word/2018/wordml/cex" xmlns:w16cid="http://schemas.microsoft.com/office/word/2016/wordml/cid" xmlns:w16="http://schemas.microsoft.com/office/word/2018/wordml" xmlns:w16du="http://schemas.microsoft.com/office/word/2023/wordml/word16du" xmlns:w16sdtdh="http://schemas.microsoft.com/office/word/2020/wordml/sdtdatahash" xmlns:w16sdtfl="http://schemas.microsoft.com/office/word/2024/wordml/sdtformatlock" xmlns:w16se="http://schemas.microsoft.com/office/word/2015/wordml/symex" xmlns:wpg="http://schemas.microsoft.com/office/word/2010/wordprocessingGroup" xmlns:wpi="http://schemas.microsoft.com/office/word/2010/wordprocessingInk" xmlns:wne="http://schemas.microsoft.com/office/word/2006/wordml" xmlns:wps="http://schemas.microsoft.com/office/word/2010/wordprocessingShape" mc:Ignorable="w14 w15 w16se w16cid w16 w16cex w16sdtdh w16sdtfl w16du wp14">
-  <w:comment w:id="0" w:author="Ana Miller-ter Kuile" w:date="2026-01-20T12:45:00Z" w:initials="AM">
-    <w:p>
-      <w:r>
-        <w:rPr>
-          <w:rStyle w:val="CommentReference"/>
-        </w:rPr>
-        <w:annotationRef/>
-      </w:r>
-      <w:r>
-        <w:rPr>
-          <w:sz w:val="20"/>
-          <w:szCs w:val="20"/>
-        </w:rPr>
-        <w:t>update</w:t>
-      </w:r>
-    </w:p>
-  </w:comment>
-  <w:comment w:id="1" w:author="Ana Miller-ter Kuile" w:date="2026-01-20T12:44:00Z" w:initials="AM">
-    <w:p>
-      <w:r>
-        <w:rPr>
-          <w:rStyle w:val="CommentReference"/>
-        </w:rPr>
-        <w:annotationRef/>
-      </w:r>
-      <w:r>
-        <w:rPr>
-          <w:sz w:val="20"/>
-          <w:szCs w:val="20"/>
-        </w:rPr>
-        <w:t xml:space="preserve">Update this figure </w:t>
-      </w:r>
-    </w:p>
-  </w:comment>
-</w:comments>
-</file>
-
-<file path=word/commentsExtended.xml><?xml version="1.0" encoding="utf-8"?>
-<w15:commentsEx xmlns:wpc="http://schemas.microsoft.com/office/word/2010/wordprocessingCanvas" xmlns:cx="http://schemas.microsoft.com/office/drawing/2014/chartex" xmlns:cx1="http://schemas.microsoft.com/office/drawing/2015/9/8/chartex" xmlns:cx2="http://schemas.microsoft.com/office/drawing/2015/10/21/chartex" xmlns:cx3="http://schemas.microsoft.com/office/drawing/2016/5/9/chartex" xmlns:cx4="http://schemas.microsoft.com/office/drawing/2016/5/10/chartex" xmlns:cx5="http://schemas.microsoft.com/office/drawing/2016/5/11/chartex" xmlns:cx6="http://schemas.microsoft.com/office/drawing/2016/5/12/chartex" xmlns:cx7="http://schemas.microsoft.com/office/drawing/2016/5/13/chartex" xmlns:cx8="http://schemas.microsoft.com/office/drawing/2016/5/14/chartex" xmlns:mc="http://schemas.openxmlformats.org/markup-compatibility/2006" xmlns:aink="http://schemas.microsoft.com/office/drawing/2016/ink" xmlns:am3d="http://schemas.microsoft.com/office/drawing/2017/model3d" xmlns:o="urn:schemas-microsoft-com:office:office" xmlns:oel="http://schemas.microsoft.com/office/2019/extlst" xmlns:r="http://schemas.openxmlformats.org/officeDocument/2006/relationships" xmlns:m="http://schemas.openxmlformats.org/officeDocument/2006/math" xmlns:v="urn:schemas-microsoft-com:vml" xmlns:wp14="http://schemas.microsoft.com/office/word/2010/wordprocessingDrawing" xmlns:wp="http://schemas.openxmlformats.org/drawingml/2006/wordprocessingDrawing" xmlns:w10="urn:schemas-microsoft-com:office:word" xmlns:w="http://schemas.openxmlformats.org/wordprocessingml/2006/main" xmlns:w14="http://schemas.microsoft.com/office/word/2010/wordml" xmlns:w15="http://schemas.microsoft.com/office/word/2012/wordml" xmlns:w16cex="http://schemas.microsoft.com/office/word/2018/wordml/cex" xmlns:w16cid="http://schemas.microsoft.com/office/word/2016/wordml/cid" xmlns:w16="http://schemas.microsoft.com/office/word/2018/wordml" xmlns:w16du="http://schemas.microsoft.com/office/word/2023/wordml/word16du" xmlns:w16sdtdh="http://schemas.microsoft.com/office/word/2020/wordml/sdtdatahash" xmlns:w16sdtfl="http://schemas.microsoft.com/office/word/2024/wordml/sdtformatlock" xmlns:w16se="http://schemas.microsoft.com/office/word/2015/wordml/symex" xmlns:wpg="http://schemas.microsoft.com/office/word/2010/wordprocessingGroup" xmlns:wpi="http://schemas.microsoft.com/office/word/2010/wordprocessingInk" xmlns:wne="http://schemas.microsoft.com/office/word/2006/wordml" xmlns:wps="http://schemas.microsoft.com/office/word/2010/wordprocessingShape" mc:Ignorable="w14 w15 w16se w16cid w16 w16cex w16sdtdh w16sdtfl w16du wp14">
-  <w15:commentEx w15:paraId="7B9E10D9" w15:done="0"/>
-  <w15:commentEx w15:paraId="0F6483C0" w15:done="0"/>
-</w15:commentsEx>
-</file>
-
-<file path=word/commentsExtensible.xml><?xml version="1.0" encoding="utf-8"?>
-<w16cex:commentsExtensible xmlns:wpc="http://schemas.microsoft.com/office/word/2010/wordprocessingCanvas" xmlns:cx="http://schemas.microsoft.com/office/drawing/2014/chartex" xmlns:cx1="http://schemas.microsoft.com/office/drawing/2015/9/8/chartex" xmlns:cx2="http://schemas.microsoft.com/office/drawing/2015/10/21/chartex" xmlns:cx3="http://schemas.microsoft.com/office/drawing/2016/5/9/chartex" xmlns:cx4="http://schemas.microsoft.com/office/drawing/2016/5/10/chartex" xmlns:cx5="http://schemas.microsoft.com/office/drawing/2016/5/11/chartex" xmlns:cx6="http://schemas.microsoft.com/office/drawing/2016/5/12/chartex" xmlns:cx7="http://schemas.microsoft.com/office/drawing/2016/5/13/chartex" xmlns:cx8="http://schemas.microsoft.com/office/drawing/2016/5/14/chartex" xmlns:cr="http://schemas.microsoft.com/office/comments/2020/reactions" xmlns:mc="http://schemas.openxmlformats.org/markup-compatibility/2006" xmlns:aink="http://schemas.microsoft.com/office/drawing/2016/ink" xmlns:am3d="http://schemas.microsoft.com/office/drawing/2017/model3d" xmlns:o="urn:schemas-microsoft-com:office:office" xmlns:oel="http://schemas.microsoft.com/office/2019/extlst" xmlns:r="http://schemas.openxmlformats.org/officeDocument/2006/relationships" xmlns:m="http://schemas.openxmlformats.org/officeDocument/2006/math" xmlns:v="urn:schemas-microsoft-com:vml" xmlns:wp14="http://schemas.microsoft.com/office/word/2010/wordprocessingDrawing" xmlns:wp="http://schemas.openxmlformats.org/drawingml/2006/wordprocessingDrawing" xmlns:w10="urn:schemas-microsoft-com:office:word" xmlns:w="http://schemas.openxmlformats.org/wordprocessingml/2006/main" xmlns:w14="http://schemas.microsoft.com/office/word/2010/wordml" xmlns:w15="http://schemas.microsoft.com/office/word/2012/wordml" xmlns:w16cex="http://schemas.microsoft.com/office/word/2018/wordml/cex" xmlns:w16cid="http://schemas.microsoft.com/office/word/2016/wordml/cid" xmlns:w16="http://schemas.microsoft.com/office/word/2018/wordml" xmlns:w16du="http://schemas.microsoft.com/office/word/2023/wordml/word16du" xmlns:w16sdtdh="http://schemas.microsoft.com/office/word/2020/wordml/sdtdatahash" xmlns:w16sdtfl="http://schemas.microsoft.com/office/word/2024/wordml/sdtformatlock" xmlns:w16se="http://schemas.microsoft.com/office/word/2015/wordml/symex" xmlns:wpg="http://schemas.microsoft.com/office/word/2010/wordprocessingGroup" xmlns:wpi="http://schemas.microsoft.com/office/word/2010/wordprocessingInk" xmlns:wne="http://schemas.microsoft.com/office/word/2006/wordml" xmlns:wps="http://schemas.microsoft.com/office/word/2010/wordprocessingShape" mc:Ignorable="w14 w15 w16se w16cid w16 w16cex w16sdtdh w16sdtfl cr w16du wp14">
-  <w16cex:commentExtensible w16cex:durableId="105C7A49" w16cex:dateUtc="2026-01-20T19:45:00Z"/>
-  <w16cex:commentExtensible w16cex:durableId="4DFD3F24" w16cex:dateUtc="2026-01-20T19:44:00Z"/>
-</w16cex:commentsExtensible>
-</file>
-
-<file path=word/commentsIds.xml><?xml version="1.0" encoding="utf-8"?>
-<w16cid:commentsIds xmlns:wpc="http://schemas.microsoft.com/office/word/2010/wordprocessingCanvas" xmlns:cx="http://schemas.microsoft.com/office/drawing/2014/chartex" xmlns:cx1="http://schemas.microsoft.com/office/drawing/2015/9/8/chartex" xmlns:cx2="http://schemas.microsoft.com/office/drawing/2015/10/21/chartex" xmlns:cx3="http://schemas.microsoft.com/office/drawing/2016/5/9/chartex" xmlns:cx4="http://schemas.microsoft.com/office/drawing/2016/5/10/chartex" xmlns:cx5="http://schemas.microsoft.com/office/drawing/2016/5/11/chartex" xmlns:cx6="http://schemas.microsoft.com/office/drawing/2016/5/12/chartex" xmlns:cx7="http://schemas.microsoft.com/office/drawing/2016/5/13/chartex" xmlns:cx8="http://schemas.microsoft.com/office/drawing/2016/5/14/chartex" xmlns:mc="http://schemas.openxmlformats.org/markup-compatibility/2006" xmlns:aink="http://schemas.microsoft.com/office/drawing/2016/ink" xmlns:am3d="http://schemas.microsoft.com/office/drawing/2017/model3d" xmlns:o="urn:schemas-microsoft-com:office:office" xmlns:oel="http://schemas.microsoft.com/office/2019/extlst" xmlns:r="http://schemas.openxmlformats.org/officeDocument/2006/relationships" xmlns:m="http://schemas.openxmlformats.org/officeDocument/2006/math" xmlns:v="urn:schemas-microsoft-com:vml" xmlns:wp14="http://schemas.microsoft.com/office/word/2010/wordprocessingDrawing" xmlns:wp="http://schemas.openxmlformats.org/drawingml/2006/wordprocessingDrawing" xmlns:w10="urn:schemas-microsoft-com:office:word" xmlns:w="http://schemas.openxmlformats.org/wordprocessingml/2006/main" xmlns:w14="http://schemas.microsoft.com/office/word/2010/wordml" xmlns:w15="http://schemas.microsoft.com/office/word/2012/wordml" xmlns:w16cex="http://schemas.microsoft.com/office/word/2018/wordml/cex" xmlns:w16cid="http://schemas.microsoft.com/office/word/2016/wordml/cid" xmlns:w16="http://schemas.microsoft.com/office/word/2018/wordml" xmlns:w16du="http://schemas.microsoft.com/office/word/2023/wordml/word16du" xmlns:w16sdtdh="http://schemas.microsoft.com/office/word/2020/wordml/sdtdatahash" xmlns:w16sdtfl="http://schemas.microsoft.com/office/word/2024/wordml/sdtformatlock" xmlns:w16se="http://schemas.microsoft.com/office/word/2015/wordml/symex" xmlns:wpg="http://schemas.microsoft.com/office/word/2010/wordprocessingGroup" xmlns:wpi="http://schemas.microsoft.com/office/word/2010/wordprocessingInk" xmlns:wne="http://schemas.microsoft.com/office/word/2006/wordml" xmlns:wps="http://schemas.microsoft.com/office/word/2010/wordprocessingShape" mc:Ignorable="w14 w15 w16se w16cid w16 w16cex w16sdtdh w16sdtfl w16du wp14">
-  <w16cid:commentId w16cid:paraId="7B9E10D9" w16cid:durableId="105C7A49"/>
-  <w16cid:commentId w16cid:paraId="0F6483C0" w16cid:durableId="4DFD3F24"/>
-</w16cid:commentsIds>
-</file>
-
-<file path=word/people.xml><?xml version="1.0" encoding="utf-8"?>
-<w15:people xmlns:wpc="http://schemas.microsoft.com/office/word/2010/wordprocessingCanvas" xmlns:cx="http://schemas.microsoft.com/office/drawing/2014/chartex" xmlns:cx1="http://schemas.microsoft.com/office/drawing/2015/9/8/chartex" xmlns:cx2="http://schemas.microsoft.com/office/drawing/2015/10/21/chartex" xmlns:cx3="http://schemas.microsoft.com/office/drawing/2016/5/9/chartex" xmlns:cx4="http://schemas.microsoft.com/office/drawing/2016/5/10/chartex" xmlns:cx5="http://schemas.microsoft.com/office/drawing/2016/5/11/chartex" xmlns:cx6="http://schemas.microsoft.com/office/drawing/2016/5/12/chartex" xmlns:cx7="http://schemas.microsoft.com/office/drawing/2016/5/13/chartex" xmlns:cx8="http://schemas.microsoft.com/office/drawing/2016/5/14/chartex" xmlns:mc="http://schemas.openxmlformats.org/markup-compatibility/2006" xmlns:aink="http://schemas.microsoft.com/office/drawing/2016/ink" xmlns:am3d="http://schemas.microsoft.com/office/drawing/2017/model3d" xmlns:o="urn:schemas-microsoft-com:office:office" xmlns:oel="http://schemas.microsoft.com/office/2019/extlst" xmlns:r="http://schemas.openxmlformats.org/officeDocument/2006/relationships" xmlns:m="http://schemas.openxmlformats.org/officeDocument/2006/math" xmlns:v="urn:schemas-microsoft-com:vml" xmlns:wp14="http://schemas.microsoft.com/office/word/2010/wordprocessingDrawing" xmlns:wp="http://schemas.openxmlformats.org/drawingml/2006/wordprocessingDrawing" xmlns:w10="urn:schemas-microsoft-com:office:word" xmlns:w="http://schemas.openxmlformats.org/wordprocessingml/2006/main" xmlns:w14="http://schemas.microsoft.com/office/word/2010/wordml" xmlns:w15="http://schemas.microsoft.com/office/word/2012/wordml" xmlns:w16cex="http://schemas.microsoft.com/office/word/2018/wordml/cex" xmlns:w16cid="http://schemas.microsoft.com/office/word/2016/wordml/cid" xmlns:w16="http://schemas.microsoft.com/office/word/2018/wordml" xmlns:w16du="http://schemas.microsoft.com/office/word/2023/wordml/word16du" xmlns:w16sdtdh="http://schemas.microsoft.com/office/word/2020/wordml/sdtdatahash" xmlns:w16sdtfl="http://schemas.microsoft.com/office/word/2024/wordml/sdtformatlock" xmlns:w16se="http://schemas.microsoft.com/office/word/2015/wordml/symex" xmlns:wpg="http://schemas.microsoft.com/office/word/2010/wordprocessingGroup" xmlns:wpi="http://schemas.microsoft.com/office/word/2010/wordprocessingInk" xmlns:wne="http://schemas.microsoft.com/office/word/2006/wordml" xmlns:wps="http://schemas.microsoft.com/office/word/2010/wordprocessingShape" mc:Ignorable="w14 w15 w16se w16cid w16 w16cex w16sdtdh w16sdtfl w16du wp14">
-  <w15:person w15:author="Ana Miller-ter Kuile">
-    <w15:presenceInfo w15:providerId="AD" w15:userId="S::Ana.Miller-ter-Kuile@nau.edu::f05f7ea4-c99a-402b-8c05-7689738ab6c0"/>
-  </w15:person>
-</w15:people>
 </file>
 
 <file path=word/styles.xml><?xml version="1.0" encoding="utf-8"?>
@@ -3973,6 +4531,33 @@
       <w14:ligatures w14:val="none"/>
     </w:rPr>
   </w:style>
+  <w:style w:type="character" w:styleId="Hyperlink">
+    <w:name w:val="Hyperlink"/>
+    <w:basedOn w:val="DefaultParagraphFont"/>
+    <w:uiPriority w:val="99"/>
+    <w:semiHidden/>
+    <w:unhideWhenUsed/>
+    <w:rsid w:val="00F27C40"/>
+    <w:rPr>
+      <w:color w:val="0000FF"/>
+      <w:u w:val="single"/>
+    </w:rPr>
+  </w:style>
+  <w:style w:type="paragraph" w:styleId="Bibliography">
+    <w:name w:val="Bibliography"/>
+    <w:basedOn w:val="Normal"/>
+    <w:next w:val="Normal"/>
+    <w:uiPriority w:val="37"/>
+    <w:unhideWhenUsed/>
+    <w:rsid w:val="008A3D06"/>
+    <w:pPr>
+      <w:tabs>
+        <w:tab w:val="left" w:pos="500"/>
+      </w:tabs>
+      <w:spacing w:after="240"/>
+      <w:ind w:left="504" w:hanging="504"/>
+    </w:pPr>
+  </w:style>
 </w:styles>
 </file>
 
@@ -4269,4 +4854,16 @@
     </a:ext>
   </a:extLst>
 </a:theme>
+</file>
+
+<file path=customXml/item1.xml><?xml version="1.0" encoding="utf-8"?>
+<b:Sources xmlns:b="http://schemas.openxmlformats.org/officeDocument/2006/bibliography" xmlns="http://schemas.openxmlformats.org/officeDocument/2006/bibliography" SelectedStyle="/APASixthEditionOfficeOnline.xsl" StyleName="APA" Version="6"/>
+</file>
+
+<file path=customXml/itemProps1.xml><?xml version="1.0" encoding="utf-8"?>
+<ds:datastoreItem xmlns:ds="http://schemas.openxmlformats.org/officeDocument/2006/customXml" ds:itemID="{35AAFE93-CF2D-CA49-9E95-D825AFBAA547}">
+  <ds:schemaRefs>
+    <ds:schemaRef ds:uri="http://schemas.openxmlformats.org/officeDocument/2006/bibliography"/>
+  </ds:schemaRefs>
+</ds:datastoreItem>
 </file>
</xml_diff>